<commit_message>
Refaz plano de segurança com base nas aulas (Aula 10 e EaD)
</commit_message>
<xml_diff>
--- a/Plano_Seguranca_API_Estoque_Pastilhas.docx
+++ b/Plano_Seguranca_API_Estoque_Pastilhas.docx
@@ -108,7 +108,7 @@
           <w:sz w:val="21"/>
           <w:szCs w:val="21"/>
         </w:rPr>
-        <w:t xml:space="preserve"> Java 21, Spring Boot (Spring Web, Spring Data JPA, Spring Security), PostgreSQL, Flyway</w:t>
+        <w:t xml:space="preserve"> Java, Spring Boot, Spring Security, Spring Data JPA, PostgreSQL, Flyway</w:t>
       </w:r>
     </w:p>
     <w:p>
@@ -137,7 +137,6 @@
     <w:p>
       <w:pPr>
         <w:pStyle w:val="Heading1"/>
-        <w:spacing w:after="160" w:before="300"/>
       </w:pPr>
       <w:r>
         <w:t xml:space="preserve">Contexto da API</w:t>
@@ -153,7 +152,7 @@
           <w:sz w:val="21"/>
           <w:szCs w:val="21"/>
         </w:rPr>
-        <w:t xml:space="preserve">A API controla o estoque de pastilhas de usinagem da DDA Metalúrgica: cadastro de pastilhas e fornecedores, registro de entradas e saídas e consulta de itens com estoque baixo. É um monólito Spring Boot organizado em camadas (Controller → Service → Repository → Domain), com dados persistidos no PostgreSQL por meio do Spring Data JPA e esquema versionado com Flyway.</w:t>
+        <w:t xml:space="preserve">A API controla o estoque de pastilhas de usinagem da DDA Metalúrgica: cadastro de pastilhas e fornecedores, registro de entradas e saídas e consulta de itens com estoque baixo. É uma aplicação Spring Boot organizada em camadas (Controller → Service → Repository → Domain), com dados no PostgreSQL via Spring Data JPA e esquema versionado com Flyway.</w:t>
       </w:r>
     </w:p>
     <w:p>
@@ -166,7 +165,7 @@
           <w:sz w:val="21"/>
           <w:szCs w:val="21"/>
         </w:rPr>
-        <w:t xml:space="preserve">Como os dados são internos da empresa e cada movimentação altera o saldo real de ferramentas, a API exige autenticação em quase todos os recursos e registra quem fez cada operação. O contrato HTTP considerado neste plano é:</w:t>
+        <w:t xml:space="preserve">Os dados são internos da empresa e cada movimentação altera o saldo real de ferramentas. Por isso a API exige autenticação em todos os recursos, exceto cadastro e login, e registra quem fez cada movimentação. Endpoints considerados:</w:t>
       </w:r>
     </w:p>
     <w:tbl>
@@ -327,7 +326,7 @@
                 <w:sz w:val="17"/>
                 <w:szCs w:val="17"/>
               </w:rPr>
-              <w:t xml:space="preserve">POST /auth/login</w:t>
+              <w:t xml:space="preserve">POST /auth/register</w:t>
             </w:r>
           </w:p>
         </w:tc>
@@ -358,7 +357,7 @@
                 <w:sz w:val="17"/>
                 <w:szCs w:val="17"/>
               </w:rPr>
-              <w:t xml:space="preserve">Autenticar e obter token</w:t>
+              <w:t xml:space="preserve">Cadastrar usuário (perfil USUARIO)</w:t>
             </w:r>
           </w:p>
         </w:tc>
@@ -389,7 +388,7 @@
                 <w:sz w:val="17"/>
                 <w:szCs w:val="17"/>
               </w:rPr>
-              <w:t xml:space="preserve">200 / 401</w:t>
+              <w:t xml:space="preserve">201 / 400</w:t>
             </w:r>
           </w:p>
         </w:tc>
@@ -426,7 +425,7 @@
                 <w:sz w:val="17"/>
                 <w:szCs w:val="17"/>
               </w:rPr>
-              <w:t xml:space="preserve">GET /pastilhas?page=&amp;size=&amp;sort=</w:t>
+              <w:t xml:space="preserve">POST /auth/login</w:t>
             </w:r>
           </w:p>
         </w:tc>
@@ -458,7 +457,7 @@
                 <w:sz w:val="17"/>
                 <w:szCs w:val="17"/>
               </w:rPr>
-              <w:t xml:space="preserve">Listar pastilhas (paginado)</w:t>
+              <w:t xml:space="preserve">Validar credenciais e devolver o token JWT</w:t>
             </w:r>
           </w:p>
         </w:tc>
@@ -526,7 +525,7 @@
                 <w:sz w:val="17"/>
                 <w:szCs w:val="17"/>
               </w:rPr>
-              <w:t xml:space="preserve">GET /pastilhas/{id}</w:t>
+              <w:t xml:space="preserve">GET /pastilhas</w:t>
             </w:r>
           </w:p>
         </w:tc>
@@ -557,7 +556,7 @@
                 <w:sz w:val="17"/>
                 <w:szCs w:val="17"/>
               </w:rPr>
-              <w:t xml:space="preserve">Consultar pastilha</w:t>
+              <w:t xml:space="preserve">Listar pastilhas (paginado)</w:t>
             </w:r>
           </w:p>
         </w:tc>
@@ -588,7 +587,7 @@
                 <w:sz w:val="17"/>
                 <w:szCs w:val="17"/>
               </w:rPr>
-              <w:t xml:space="preserve">200 / 404</w:t>
+              <w:t xml:space="preserve">200 / 401</w:t>
             </w:r>
           </w:p>
         </w:tc>
@@ -625,7 +624,7 @@
                 <w:sz w:val="17"/>
                 <w:szCs w:val="17"/>
               </w:rPr>
-              <w:t xml:space="preserve">GET /pastilhas/pesquisa?codigo=</w:t>
+              <w:t xml:space="preserve">GET /pastilhas/{id}</w:t>
             </w:r>
           </w:p>
         </w:tc>
@@ -657,7 +656,7 @@
                 <w:sz w:val="17"/>
                 <w:szCs w:val="17"/>
               </w:rPr>
-              <w:t xml:space="preserve">Pesquisar por código/descrição</w:t>
+              <w:t xml:space="preserve">Consultar pastilha</w:t>
             </w:r>
           </w:p>
         </w:tc>
@@ -689,7 +688,7 @@
                 <w:sz w:val="17"/>
                 <w:szCs w:val="17"/>
               </w:rPr>
-              <w:t xml:space="preserve">200</w:t>
+              <w:t xml:space="preserve">200 / 404</w:t>
             </w:r>
           </w:p>
         </w:tc>
@@ -725,7 +724,7 @@
                 <w:sz w:val="17"/>
                 <w:szCs w:val="17"/>
               </w:rPr>
-              <w:t xml:space="preserve">GET /pastilhas/estoque-baixo</w:t>
+              <w:t xml:space="preserve">GET /pastilhas/pesquisa?codigo=</w:t>
             </w:r>
           </w:p>
         </w:tc>
@@ -756,7 +755,7 @@
                 <w:sz w:val="17"/>
                 <w:szCs w:val="17"/>
               </w:rPr>
-              <w:t xml:space="preserve">Pastilhas abaixo do estoque mínimo</w:t>
+              <w:t xml:space="preserve">Pesquisar pastilha por código</w:t>
             </w:r>
           </w:p>
         </w:tc>
@@ -824,7 +823,7 @@
                 <w:sz w:val="17"/>
                 <w:szCs w:val="17"/>
               </w:rPr>
-              <w:t xml:space="preserve">POST /pastilhas</w:t>
+              <w:t xml:space="preserve">GET /pastilhas/estoque-baixo</w:t>
             </w:r>
           </w:p>
         </w:tc>
@@ -856,7 +855,7 @@
                 <w:sz w:val="17"/>
                 <w:szCs w:val="17"/>
               </w:rPr>
-              <w:t xml:space="preserve">Cadastrar pastilha</w:t>
+              <w:t xml:space="preserve">Pastilhas abaixo do estoque mínimo</w:t>
             </w:r>
           </w:p>
         </w:tc>
@@ -888,7 +887,7 @@
                 <w:sz w:val="17"/>
                 <w:szCs w:val="17"/>
               </w:rPr>
-              <w:t xml:space="preserve">201 / 400 / 403</w:t>
+              <w:t xml:space="preserve">200</w:t>
             </w:r>
           </w:p>
         </w:tc>
@@ -924,7 +923,7 @@
                 <w:sz w:val="17"/>
                 <w:szCs w:val="17"/>
               </w:rPr>
-              <w:t xml:space="preserve">PUT /pastilhas/{id}</w:t>
+              <w:t xml:space="preserve">POST /pastilhas</w:t>
             </w:r>
           </w:p>
         </w:tc>
@@ -955,7 +954,7 @@
                 <w:sz w:val="17"/>
                 <w:szCs w:val="17"/>
               </w:rPr>
-              <w:t xml:space="preserve">Atualizar pastilha</w:t>
+              <w:t xml:space="preserve">Cadastrar pastilha</w:t>
             </w:r>
           </w:p>
         </w:tc>
@@ -986,7 +985,7 @@
                 <w:sz w:val="17"/>
                 <w:szCs w:val="17"/>
               </w:rPr>
-              <w:t xml:space="preserve">200 / 403 / 404</w:t>
+              <w:t xml:space="preserve">201 / 400 / 403</w:t>
             </w:r>
           </w:p>
         </w:tc>
@@ -1023,7 +1022,7 @@
                 <w:sz w:val="17"/>
                 <w:szCs w:val="17"/>
               </w:rPr>
-              <w:t xml:space="preserve">DELETE /pastilhas/{id}</w:t>
+              <w:t xml:space="preserve">PUT /pastilhas/{id}</w:t>
             </w:r>
           </w:p>
         </w:tc>
@@ -1055,7 +1054,7 @@
                 <w:sz w:val="17"/>
                 <w:szCs w:val="17"/>
               </w:rPr>
-              <w:t xml:space="preserve">Remover pastilha</w:t>
+              <w:t xml:space="preserve">Atualizar pastilha</w:t>
             </w:r>
           </w:p>
         </w:tc>
@@ -1087,7 +1086,7 @@
                 <w:sz w:val="17"/>
                 <w:szCs w:val="17"/>
               </w:rPr>
-              <w:t xml:space="preserve">204 / 403 / 404</w:t>
+              <w:t xml:space="preserve">200 / 403 / 404</w:t>
             </w:r>
           </w:p>
         </w:tc>
@@ -1123,7 +1122,7 @@
                 <w:sz w:val="17"/>
                 <w:szCs w:val="17"/>
               </w:rPr>
-              <w:t xml:space="preserve">GET, POST, PUT, DELETE /fornecedores[/{id}]</w:t>
+              <w:t xml:space="preserve">DELETE /pastilhas/{id}</w:t>
             </w:r>
           </w:p>
         </w:tc>
@@ -1154,7 +1153,7 @@
                 <w:sz w:val="17"/>
                 <w:szCs w:val="17"/>
               </w:rPr>
-              <w:t xml:space="preserve">CRUD de fornecedores</w:t>
+              <w:t xml:space="preserve">Remover pastilha</w:t>
             </w:r>
           </w:p>
         </w:tc>
@@ -1185,7 +1184,7 @@
                 <w:sz w:val="17"/>
                 <w:szCs w:val="17"/>
               </w:rPr>
-              <w:t xml:space="preserve">200 / 201 / 204 / 403 / 404</w:t>
+              <w:t xml:space="preserve">204 / 403 / 404</w:t>
             </w:r>
           </w:p>
         </w:tc>
@@ -1222,7 +1221,7 @@
                 <w:sz w:val="17"/>
                 <w:szCs w:val="17"/>
               </w:rPr>
-              <w:t xml:space="preserve">GET /movimentacoes</w:t>
+              <w:t xml:space="preserve">GET /fornecedores, GET /fornecedores/{id}</w:t>
             </w:r>
           </w:p>
         </w:tc>
@@ -1254,7 +1253,7 @@
                 <w:sz w:val="17"/>
                 <w:szCs w:val="17"/>
               </w:rPr>
-              <w:t xml:space="preserve">Histórico de entradas e saídas</w:t>
+              <w:t xml:space="preserve">Consultar fornecedores</w:t>
             </w:r>
           </w:p>
         </w:tc>
@@ -1286,7 +1285,7 @@
                 <w:sz w:val="17"/>
                 <w:szCs w:val="17"/>
               </w:rPr>
-              <w:t xml:space="preserve">200</w:t>
+              <w:t xml:space="preserve">200 / 404</w:t>
             </w:r>
           </w:p>
         </w:tc>
@@ -1322,7 +1321,7 @@
                 <w:sz w:val="17"/>
                 <w:szCs w:val="17"/>
               </w:rPr>
-              <w:t xml:space="preserve">POST /movimentacoes</w:t>
+              <w:t xml:space="preserve">POST, PUT, DELETE /fornecedores</w:t>
             </w:r>
           </w:p>
         </w:tc>
@@ -1353,7 +1352,7 @@
                 <w:sz w:val="17"/>
                 <w:szCs w:val="17"/>
               </w:rPr>
-              <w:t xml:space="preserve">Registrar entrada ou saída</w:t>
+              <w:t xml:space="preserve">Manter fornecedores</w:t>
             </w:r>
           </w:p>
         </w:tc>
@@ -1384,7 +1383,7 @@
                 <w:sz w:val="17"/>
                 <w:szCs w:val="17"/>
               </w:rPr>
-              <w:t xml:space="preserve">201 / 400 / 422</w:t>
+              <w:t xml:space="preserve">201 / 200 / 204 / 403</w:t>
             </w:r>
           </w:p>
         </w:tc>
@@ -1421,7 +1420,7 @@
                 <w:sz w:val="17"/>
                 <w:szCs w:val="17"/>
               </w:rPr>
-              <w:t xml:space="preserve">POST /movimentacoes/{id}/estorno</w:t>
+              <w:t xml:space="preserve">GET /movimentacoes</w:t>
             </w:r>
           </w:p>
         </w:tc>
@@ -1453,7 +1452,7 @@
                 <w:sz w:val="17"/>
                 <w:szCs w:val="17"/>
               </w:rPr>
-              <w:t xml:space="preserve">Estornar movimentação</w:t>
+              <w:t xml:space="preserve">Histórico de entradas e saídas</w:t>
             </w:r>
           </w:p>
         </w:tc>
@@ -1485,7 +1484,7 @@
                 <w:sz w:val="17"/>
                 <w:szCs w:val="17"/>
               </w:rPr>
-              <w:t xml:space="preserve">201 / 403 / 404</w:t>
+              <w:t xml:space="preserve">200</w:t>
             </w:r>
           </w:p>
         </w:tc>
@@ -1521,7 +1520,7 @@
                 <w:sz w:val="17"/>
                 <w:szCs w:val="17"/>
               </w:rPr>
-              <w:t xml:space="preserve">GET, POST, PUT, DELETE /usuarios[/{id}]</w:t>
+              <w:t xml:space="preserve">POST /movimentacoes</w:t>
             </w:r>
           </w:p>
         </w:tc>
@@ -1552,7 +1551,7 @@
                 <w:sz w:val="17"/>
                 <w:szCs w:val="17"/>
               </w:rPr>
-              <w:t xml:space="preserve">Gerenciar usuários</w:t>
+              <w:t xml:space="preserve">Registrar entrada ou saída de estoque</w:t>
             </w:r>
           </w:p>
         </w:tc>
@@ -1583,7 +1582,7 @@
                 <w:sz w:val="17"/>
                 <w:szCs w:val="17"/>
               </w:rPr>
-              <w:t xml:space="preserve">200 / 201 / 204 / 403 / 404</w:t>
+              <w:t xml:space="preserve">201 / 400</w:t>
             </w:r>
           </w:p>
         </w:tc>
@@ -1620,7 +1619,7 @@
                 <w:sz w:val="17"/>
                 <w:szCs w:val="17"/>
               </w:rPr>
-              <w:t xml:space="preserve">GET, PUT /usuarios/me</w:t>
+              <w:t xml:space="preserve">GET, PUT, DELETE /usuarios</w:t>
             </w:r>
           </w:p>
         </w:tc>
@@ -1652,7 +1651,7 @@
                 <w:sz w:val="17"/>
                 <w:szCs w:val="17"/>
               </w:rPr>
-              <w:t xml:space="preserve">Ver dados e trocar a própria senha</w:t>
+              <w:t xml:space="preserve">Gerenciar usuários</w:t>
             </w:r>
           </w:p>
         </w:tc>
@@ -1684,105 +1683,7 @@
                 <w:sz w:val="17"/>
                 <w:szCs w:val="17"/>
               </w:rPr>
-              <w:t xml:space="preserve">200 / 401</w:t>
-            </w:r>
-          </w:p>
-        </w:tc>
-      </w:tr>
-      <w:tr>
-        <w:trPr>
-          <w:cantSplit/>
-        </w:trPr>
-        <w:tc>
-          <w:tcPr>
-            <w:tcW w:type="dxa" w:w="4000"/>
-            <w:tcBorders>
-              <w:top w:val="single" w:color="A6B4C4" w:sz="4"/>
-              <w:left w:val="single" w:color="A6B4C4" w:sz="4"/>
-              <w:bottom w:val="single" w:color="A6B4C4" w:sz="4"/>
-              <w:right w:val="single" w:color="A6B4C4" w:sz="4"/>
-            </w:tcBorders>
-            <w:tcMar>
-              <w:top w:type="dxa" w:w="60"/>
-              <w:left w:type="dxa" w:w="90"/>
-              <w:bottom w:type="dxa" w:w="60"/>
-              <w:right w:type="dxa" w:w="90"/>
-            </w:tcMar>
-            <w:vAlign w:val="center"/>
-          </w:tcPr>
-          <w:p>
-            <w:pPr>
-              <w:jc w:val="left"/>
-            </w:pPr>
-            <w:r>
-              <w:rPr>
-                <w:rFonts w:ascii="Arial" w:cs="Arial" w:eastAsia="Arial" w:hAnsi="Arial"/>
-                <w:sz w:val="17"/>
-                <w:szCs w:val="17"/>
-              </w:rPr>
-              <w:t xml:space="preserve">GET /actuator/health</w:t>
-            </w:r>
-          </w:p>
-        </w:tc>
-        <w:tc>
-          <w:tcPr>
-            <w:tcW w:type="dxa" w:w="3638"/>
-            <w:tcBorders>
-              <w:top w:val="single" w:color="A6B4C4" w:sz="4"/>
-              <w:left w:val="single" w:color="A6B4C4" w:sz="4"/>
-              <w:bottom w:val="single" w:color="A6B4C4" w:sz="4"/>
-              <w:right w:val="single" w:color="A6B4C4" w:sz="4"/>
-            </w:tcBorders>
-            <w:tcMar>
-              <w:top w:type="dxa" w:w="60"/>
-              <w:left w:type="dxa" w:w="90"/>
-              <w:bottom w:type="dxa" w:w="60"/>
-              <w:right w:type="dxa" w:w="90"/>
-            </w:tcMar>
-            <w:vAlign w:val="center"/>
-          </w:tcPr>
-          <w:p>
-            <w:pPr>
-              <w:jc w:val="left"/>
-            </w:pPr>
-            <w:r>
-              <w:rPr>
-                <w:rFonts w:ascii="Arial" w:cs="Arial" w:eastAsia="Arial" w:hAnsi="Arial"/>
-                <w:sz w:val="17"/>
-                <w:szCs w:val="17"/>
-              </w:rPr>
-              <w:t xml:space="preserve">Verificar se a API está no ar</w:t>
-            </w:r>
-          </w:p>
-        </w:tc>
-        <w:tc>
-          <w:tcPr>
-            <w:tcW w:type="dxa" w:w="2000"/>
-            <w:tcBorders>
-              <w:top w:val="single" w:color="A6B4C4" w:sz="4"/>
-              <w:left w:val="single" w:color="A6B4C4" w:sz="4"/>
-              <w:bottom w:val="single" w:color="A6B4C4" w:sz="4"/>
-              <w:right w:val="single" w:color="A6B4C4" w:sz="4"/>
-            </w:tcBorders>
-            <w:tcMar>
-              <w:top w:type="dxa" w:w="60"/>
-              <w:left w:type="dxa" w:w="90"/>
-              <w:bottom w:type="dxa" w:w="60"/>
-              <w:right w:type="dxa" w:w="90"/>
-            </w:tcMar>
-            <w:vAlign w:val="center"/>
-          </w:tcPr>
-          <w:p>
-            <w:pPr>
-              <w:jc w:val="center"/>
-            </w:pPr>
-            <w:r>
-              <w:rPr>
-                <w:rFonts w:ascii="Arial" w:cs="Arial" w:eastAsia="Arial" w:hAnsi="Arial"/>
-                <w:sz w:val="17"/>
-                <w:szCs w:val="17"/>
-              </w:rPr>
-              <w:t xml:space="preserve">200</w:t>
+              <w:t xml:space="preserve">200 / 204 / 403</w:t>
             </w:r>
           </w:p>
         </w:tc>
@@ -1807,7 +1708,7 @@
           <w:sz w:val="21"/>
           <w:szCs w:val="21"/>
         </w:rPr>
-        <w:t xml:space="preserve">A matriz relaciona cada recurso ou operação da API às ameaças pertinentes, ao impacto possível e ao controle preventivo que será implementado.</w:t>
+        <w:t xml:space="preserve">A matriz relaciona cada recurso ou operação da API às ameaças estudadas, ao impacto possível e ao controle preventivo que será implementado.</w:t>
       </w:r>
     </w:p>
     <w:tbl>
@@ -2102,7 +2003,7 @@
                 <w:sz w:val="16"/>
                 <w:szCs w:val="16"/>
               </w:rPr>
-              <w:t xml:space="preserve">Tentativas repetidas de senha (força bruta)</w:t>
+              <w:t xml:space="preserve">Tentativas de acesso indevido (senha errada ou de outra pessoa)</w:t>
             </w:r>
           </w:p>
         </w:tc>
@@ -2133,7 +2034,7 @@
                 <w:sz w:val="16"/>
                 <w:szCs w:val="16"/>
               </w:rPr>
-              <w:t xml:space="preserve">Acesso indevido a uma conta e ao estoque</w:t>
+              <w:t xml:space="preserve">Acesso não autorizado ao estoque</w:t>
             </w:r>
           </w:p>
         </w:tc>
@@ -2164,7 +2065,7 @@
                 <w:sz w:val="16"/>
                 <w:szCs w:val="16"/>
               </w:rPr>
-              <w:t xml:space="preserve">Senhas com hash BCrypt; bloqueio temporário após 5 falhas seguidas (contador na entidade Usuario); resposta 401 sem detalhes</w:t>
+              <w:t xml:space="preserve">Login validado pelo Spring Security: AuthenticationManager, UserDetailsService (busca por e-mail) e PasswordEncoder (compara a senha com o hash). Credencial inválida responde 401. Usuário com ativo = false não autentica</w:t>
             </w:r>
           </w:p>
         </w:tc>
@@ -2233,7 +2134,7 @@
                 <w:sz w:val="16"/>
                 <w:szCs w:val="16"/>
               </w:rPr>
-              <w:t xml:space="preserve">POST /auth/login</w:t>
+              <w:t xml:space="preserve">Tabela usuarios (PostgreSQL)</w:t>
             </w:r>
           </w:p>
         </w:tc>
@@ -2265,7 +2166,7 @@
                 <w:sz w:val="16"/>
                 <w:szCs w:val="16"/>
               </w:rPr>
-              <w:t xml:space="preserve">Descobrir quais usuários existem pela mensagem de erro</w:t>
+              <w:t xml:space="preserve">Vazamento dos dados do banco</w:t>
             </w:r>
           </w:p>
         </w:tc>
@@ -2297,7 +2198,7 @@
                 <w:sz w:val="16"/>
                 <w:szCs w:val="16"/>
               </w:rPr>
-              <w:t xml:space="preserve">Facilita ataques direcionados</w:t>
+              <w:t xml:space="preserve">Senhas expostas e reutilizadas em outros sistemas</w:t>
             </w:r>
           </w:p>
         </w:tc>
@@ -2329,7 +2230,7 @@
                 <w:sz w:val="16"/>
                 <w:szCs w:val="16"/>
               </w:rPr>
-              <w:t xml:space="preserve">Mesma resposta (401 "Usuário ou senha inválidos") para usuário inexistente ou senha errada</w:t>
+              <w:t xml:space="preserve">Senha guardada só como hash BCrypt (salt + custo). O DTO de resposta nunca devolve a senha</w:t>
             </w:r>
           </w:p>
         </w:tc>
@@ -2396,7 +2297,7 @@
                 <w:sz w:val="16"/>
                 <w:szCs w:val="16"/>
               </w:rPr>
-              <w:t xml:space="preserve">Header Authorization (token JWT)</w:t>
+              <w:t xml:space="preserve">POST /auth/register</w:t>
             </w:r>
           </w:p>
         </w:tc>
@@ -2427,7 +2328,7 @@
                 <w:sz w:val="16"/>
                 <w:szCs w:val="16"/>
               </w:rPr>
-              <w:t xml:space="preserve">Token falsificado, roubado ou usado depois de vencido</w:t>
+              <w:t xml:space="preserve">Cadastro tentando se dar o perfil ADMIN, ou com dados inválidos/e-mail repetido</w:t>
             </w:r>
           </w:p>
         </w:tc>
@@ -2458,7 +2359,7 @@
                 <w:sz w:val="16"/>
                 <w:szCs w:val="16"/>
               </w:rPr>
-              <w:t xml:space="preserve">Alguém age com a identidade de outro usuário</w:t>
+              <w:t xml:space="preserve">Escalonamento de privilégio e dados inconsistentes</w:t>
             </w:r>
           </w:p>
         </w:tc>
@@ -2489,7 +2390,7 @@
                 <w:sz w:val="16"/>
                 <w:szCs w:val="16"/>
               </w:rPr>
-              <w:t xml:space="preserve">Token assinado com chave secreta e expiração de 1 h; filtro do Spring Security valida assinatura e validade em toda requisição; envio apenas pelo header Authorization: Bearer</w:t>
+              <w:t xml:space="preserve">DTO de entrada só com nome, e-mail e senha; o perfil USUARIO é definido no Service, nunca vem do JSON. Bean Validation (@NotBlank, @Email, @Size) e e-mail UNIQUE no banco</w:t>
             </w:r>
           </w:p>
         </w:tc>
@@ -2558,7 +2459,7 @@
                 <w:sz w:val="16"/>
                 <w:szCs w:val="16"/>
               </w:rPr>
-              <w:t xml:space="preserve">Tabela usuario (PostgreSQL)</w:t>
+              <w:t xml:space="preserve">Header Authorization: Bearer &lt;token&gt;</w:t>
             </w:r>
           </w:p>
         </w:tc>
@@ -2590,7 +2491,7 @@
                 <w:sz w:val="16"/>
                 <w:szCs w:val="16"/>
               </w:rPr>
-              <w:t xml:space="preserve">Vazamento do banco de dados</w:t>
+              <w:t xml:space="preserve">Token falsificado, alterado ou vencido</w:t>
             </w:r>
           </w:p>
         </w:tc>
@@ -2622,7 +2523,7 @@
                 <w:sz w:val="16"/>
                 <w:szCs w:val="16"/>
               </w:rPr>
-              <w:t xml:space="preserve">Senhas expostas e reutilizadas em outros sistemas</w:t>
+              <w:t xml:space="preserve">Alguém age com a identidade de outro usuário</w:t>
             </w:r>
           </w:p>
         </w:tc>
@@ -2654,7 +2555,7 @@
                 <w:sz w:val="16"/>
                 <w:szCs w:val="16"/>
               </w:rPr>
-              <w:t xml:space="preserve">Coluna senha guarda só o hash BCrypt; a entidade Usuario nunca é devolvida no JSON (resposta usa UsuarioResponse, sem senha)</w:t>
+              <w:t xml:space="preserve">JWT assinado: a assinatura (signature) detecta alterações; claims sub, iat e exp; o token é validado na cadeia de filtros antes do Controller</w:t>
             </w:r>
           </w:p>
         </w:tc>
@@ -2721,7 +2622,7 @@
                 <w:sz w:val="16"/>
                 <w:szCs w:val="16"/>
               </w:rPr>
-              <w:t xml:space="preserve">POST/PUT /pastilhas e /fornecedores</w:t>
+              <w:t xml:space="preserve">Todos os endpoints, exceto /auth/**</w:t>
             </w:r>
           </w:p>
         </w:tc>
@@ -2752,7 +2653,7 @@
                 <w:sz w:val="16"/>
                 <w:szCs w:val="16"/>
               </w:rPr>
-              <w:t xml:space="preserve">SQL Injection pelo corpo da requisição</w:t>
+              <w:t xml:space="preserve">Acesso sem autenticação</w:t>
             </w:r>
           </w:p>
         </w:tc>
@@ -2783,7 +2684,7 @@
                 <w:sz w:val="16"/>
                 <w:szCs w:val="16"/>
               </w:rPr>
-              <w:t xml:space="preserve">Leitura, alteração ou exclusão indevida de dados</w:t>
+              <w:t xml:space="preserve">Exposição ou alteração indevida das informações do estoque</w:t>
             </w:r>
           </w:p>
         </w:tc>
@@ -2814,7 +2715,7 @@
                 <w:sz w:val="16"/>
                 <w:szCs w:val="16"/>
               </w:rPr>
-              <w:t xml:space="preserve">Persistência pelo JpaRepository (save, findById); Hibernate gera SQL parametrizado, igual ao PreparedStatement com "?"; Bean Validation (@Valid) nos records de request</w:t>
+              <w:t xml:space="preserve">anyRequest().authenticated() no SecurityFilterChain: sem token válido a resposta é 401</w:t>
             </w:r>
           </w:p>
         </w:tc>
@@ -2883,7 +2784,7 @@
                 <w:sz w:val="16"/>
                 <w:szCs w:val="16"/>
               </w:rPr>
-              <w:t xml:space="preserve">GET /pastilhas/pesquisa?codigo=</w:t>
+              <w:t xml:space="preserve">POST, PUT, DELETE de pastilhas e fornecedores; /usuarios</w:t>
             </w:r>
           </w:p>
         </w:tc>
@@ -2915,7 +2816,7 @@
                 <w:sz w:val="16"/>
                 <w:szCs w:val="16"/>
               </w:rPr>
-              <w:t xml:space="preserve">SQL Injection pelo parâmetro de pesquisa</w:t>
+              <w:t xml:space="preserve">Acesso sem autorização (Usuário comum tentando operação de Administrador)</w:t>
             </w:r>
           </w:p>
         </w:tc>
@@ -2947,7 +2848,7 @@
                 <w:sz w:val="16"/>
                 <w:szCs w:val="16"/>
               </w:rPr>
-              <w:t xml:space="preserve">Vazamento de dados de outras tabelas</w:t>
+              <w:t xml:space="preserve">Alteração do cadastro, exclusão de registros ou de contas</w:t>
             </w:r>
           </w:p>
         </w:tc>
@@ -2979,7 +2880,7 @@
                 <w:sz w:val="16"/>
                 <w:szCs w:val="16"/>
               </w:rPr>
-              <w:t xml:space="preserve">Consultas derivadas (findByCodigoContainingIgnoreCase) ou @Query em JPQL com @Param; proibido montar SQL concatenando Strings, inclusive em nativeQuery</w:t>
+              <w:t xml:space="preserve">Controle de acesso por perfil (ADMIN / USUARIO) nas regras do SecurityFilterChain; resposta 403</w:t>
             </w:r>
           </w:p>
         </w:tc>
@@ -3046,7 +2947,7 @@
                 <w:sz w:val="16"/>
                 <w:szCs w:val="16"/>
               </w:rPr>
-              <w:t xml:space="preserve">Campos de texto (descrição, observação, nome do fornecedor)</w:t>
+              <w:t xml:space="preserve">POST e PUT /pastilhas e /fornecedores</w:t>
             </w:r>
           </w:p>
         </w:tc>
@@ -3077,7 +2978,7 @@
                 <w:sz w:val="16"/>
                 <w:szCs w:val="16"/>
               </w:rPr>
-              <w:t xml:space="preserve">XSS armazenado (script salvo e exibido depois no front-end)</w:t>
+              <w:t xml:space="preserve">SQL Injection pelo corpo da requisição</w:t>
             </w:r>
           </w:p>
         </w:tc>
@@ -3108,7 +3009,7 @@
                 <w:sz w:val="16"/>
                 <w:szCs w:val="16"/>
               </w:rPr>
-              <w:t xml:space="preserve">Script executado no navegador de outro usuário, podendo roubar o token</w:t>
+              <w:t xml:space="preserve">Manipulação ou acesso indevido aos dados</w:t>
             </w:r>
           </w:p>
         </w:tc>
@@ -3139,7 +3040,7 @@
                 <w:sz w:val="16"/>
                 <w:szCs w:val="16"/>
               </w:rPr>
-              <w:t xml:space="preserve">Validação com @Size e @Pattern nos records; API responde sempre Content-Type: application/json; front-end exibe os dados como texto; header X-Content-Type-Options: nosniff</w:t>
+              <w:t xml:space="preserve">Persistência pelo JpaRepository (save, findById): o Hibernate gera SQL com parâmetros, como o PreparedStatement com "?". Validação das entradas com Bean Validation nos DTOs</w:t>
             </w:r>
           </w:p>
         </w:tc>
@@ -3208,7 +3109,7 @@
                 <w:sz w:val="16"/>
                 <w:szCs w:val="16"/>
               </w:rPr>
-              <w:t xml:space="preserve">Todos os endpoints, exceto login e health</w:t>
+              <w:t xml:space="preserve">GET /pastilhas/pesquisa</w:t>
             </w:r>
           </w:p>
         </w:tc>
@@ -3240,7 +3141,7 @@
                 <w:sz w:val="16"/>
                 <w:szCs w:val="16"/>
               </w:rPr>
-              <w:t xml:space="preserve">Acesso sem autenticação</w:t>
+              <w:t xml:space="preserve">SQL Injection pelo parâmetro de busca</w:t>
             </w:r>
           </w:p>
         </w:tc>
@@ -3272,7 +3173,7 @@
                 <w:sz w:val="16"/>
                 <w:szCs w:val="16"/>
               </w:rPr>
-              <w:t xml:space="preserve">Exposição ou alteração do estoque por qualquer pessoa</w:t>
+              <w:t xml:space="preserve">Leitura de dados de outras tabelas</w:t>
             </w:r>
           </w:p>
         </w:tc>
@@ -3304,7 +3205,7 @@
                 <w:sz w:val="16"/>
                 <w:szCs w:val="16"/>
               </w:rPr>
-              <w:t xml:space="preserve">Spring Security exige token em toda rota não pública; sem token a resposta é 401 Unauthorized</w:t>
+              <w:t xml:space="preserve">Consulta derivada (findByCodigoContainingIgnoreCase) ou @Query em JPQL com @Param. Nunca concatenar texto do usuário em SQL, nem em nativeQuery</w:t>
             </w:r>
           </w:p>
         </w:tc>
@@ -3371,7 +3272,7 @@
                 <w:sz w:val="16"/>
                 <w:szCs w:val="16"/>
               </w:rPr>
-              <w:t xml:space="preserve">POST/PUT/DELETE de pastilhas, fornecedores e usuários; estorno</w:t>
+              <w:t xml:space="preserve">Campos de texto (descrição da pastilha, nome do fornecedor, observação)</w:t>
             </w:r>
           </w:p>
         </w:tc>
@@ -3402,7 +3303,7 @@
                 <w:sz w:val="16"/>
                 <w:szCs w:val="16"/>
               </w:rPr>
-              <w:t xml:space="preserve">Usuário comum tentando operação de Administrador</w:t>
+              <w:t xml:space="preserve">XSS (script salvo e exibido depois no front-end)</w:t>
             </w:r>
           </w:p>
         </w:tc>
@@ -3433,7 +3334,7 @@
                 <w:sz w:val="16"/>
                 <w:szCs w:val="16"/>
               </w:rPr>
-              <w:t xml:space="preserve">Alteração do catálogo, exclusão de registros ou criação de contas</w:t>
+              <w:t xml:space="preserve">Execução de script no navegador de outro usuário, podendo roubar o token</w:t>
             </w:r>
           </w:p>
         </w:tc>
@@ -3464,7 +3365,7 @@
                 <w:sz w:val="16"/>
                 <w:szCs w:val="16"/>
               </w:rPr>
-              <w:t xml:space="preserve">Autorização por perfil (hasRole) nas rotas e @PreAuthorize no Service; perfil vem do banco/token, nunca do JSON; resposta 403 Forbidden</w:t>
+              <w:t xml:space="preserve">Validação das entradas (@NotBlank, @Size) nos DTOs; API responde sempre JSON (Content-Type: application/json); o front-end exibe os dados como texto</w:t>
             </w:r>
           </w:p>
         </w:tc>
@@ -3533,7 +3434,7 @@
                 <w:sz w:val="16"/>
                 <w:szCs w:val="16"/>
               </w:rPr>
-              <w:t xml:space="preserve">GET /usuarios/{id}</w:t>
+              <w:t xml:space="preserve">POST /movimentacoes</w:t>
             </w:r>
           </w:p>
         </w:tc>
@@ -3565,7 +3466,7 @@
                 <w:sz w:val="16"/>
                 <w:szCs w:val="16"/>
               </w:rPr>
-              <w:t xml:space="preserve">Trocar o id na URL para ver outro usuário (IDOR)</w:t>
+              <w:t xml:space="preserve">Dados inválidos: quantidade negativa ou saída maior que o saldo</w:t>
             </w:r>
           </w:p>
         </w:tc>
@@ -3597,7 +3498,7 @@
                 <w:sz w:val="16"/>
                 <w:szCs w:val="16"/>
               </w:rPr>
-              <w:t xml:space="preserve">Exposição de dados de colegas</w:t>
+              <w:t xml:space="preserve">Estoque inconsistente</w:t>
             </w:r>
           </w:p>
         </w:tc>
@@ -3629,7 +3530,7 @@
                 <w:sz w:val="16"/>
                 <w:szCs w:val="16"/>
               </w:rPr>
-              <w:t xml:space="preserve">Usuário comum só acessa /usuarios/me; /usuarios/{id} é exclusivo do Administrador</w:t>
+              <w:t xml:space="preserve">@Positive na quantidade; o Service confere o saldo antes de salvar; @Transactional faz rollback se algo falhar. O usuário responsável vem do token (SecurityContext), não do JSON</w:t>
             </w:r>
           </w:p>
         </w:tc>
@@ -3696,7 +3597,7 @@
                 <w:sz w:val="16"/>
                 <w:szCs w:val="16"/>
               </w:rPr>
-              <w:t xml:space="preserve">POST /movimentacoes</w:t>
+              <w:t xml:space="preserve">Requisições vindas do navegador</w:t>
             </w:r>
           </w:p>
         </w:tc>
@@ -3727,7 +3628,7 @@
                 <w:sz w:val="16"/>
                 <w:szCs w:val="16"/>
               </w:rPr>
-              <w:t xml:space="preserve">Dados manipulados: quantidade negativa, saída maior que o saldo, envio de campos como usuarioId ou data</w:t>
+              <w:t xml:space="preserve">CSRF (site malicioso aproveita a sessão do usuário)</w:t>
             </w:r>
           </w:p>
         </w:tc>
@@ -3758,7 +3659,7 @@
                 <w:sz w:val="16"/>
                 <w:szCs w:val="16"/>
               </w:rPr>
-              <w:t xml:space="preserve">Estoque inconsistente e retiradas sem rastreio</w:t>
+              <w:t xml:space="preserve">Operações feitas sem o usuário saber</w:t>
             </w:r>
           </w:p>
         </w:tc>
@@ -3789,7 +3690,7 @@
                 <w:sz w:val="16"/>
                 <w:szCs w:val="16"/>
               </w:rPr>
-              <w:t xml:space="preserve">Record MovimentacaoRequest só com tipo, pastilhaId, quantidade e observação; @Positive na quantidade; Service valida o saldo; @Transactional faz rollback se algo falhar; usuário e data definidos pelo servidor</w:t>
+              <w:t xml:space="preserve">API stateless: sem sessão e sem cookie, o token vai no header Authorization. Por isso csrf.disable(), como na Aula 10</w:t>
             </w:r>
           </w:p>
         </w:tc>
@@ -3858,7 +3759,7 @@
                 <w:sz w:val="16"/>
                 <w:szCs w:val="16"/>
               </w:rPr>
-              <w:t xml:space="preserve">Requisições vindas do navegador</w:t>
+              <w:t xml:space="preserve">Acesso de outros sites (navegador)</w:t>
             </w:r>
           </w:p>
         </w:tc>
@@ -3890,7 +3791,7 @@
                 <w:sz w:val="16"/>
                 <w:szCs w:val="16"/>
               </w:rPr>
-              <w:t xml:space="preserve">CSRF (site malicioso dispara requisição usando a sessão do usuário)</w:t>
+              <w:t xml:space="preserve">CORS liberado para qualquer origem</w:t>
             </w:r>
           </w:p>
         </w:tc>
@@ -3922,7 +3823,7 @@
                 <w:sz w:val="16"/>
                 <w:szCs w:val="16"/>
               </w:rPr>
-              <w:t xml:space="preserve">Operações feitas sem o usuário saber</w:t>
+              <w:t xml:space="preserve">Sites de terceiros consumindo a API</w:t>
             </w:r>
           </w:p>
         </w:tc>
@@ -3954,7 +3855,7 @@
                 <w:sz w:val="16"/>
                 <w:szCs w:val="16"/>
               </w:rPr>
-              <w:t xml:space="preserve">API sem sessão e sem cookie: o token vai no header Authorization, que o navegador não envia sozinho; por isso o CSRF do Spring Security é desabilitado de forma justificada</w:t>
+              <w:t xml:space="preserve">CORS liberado só para a origem do front-end do projeto, com os métodos e headers usados</w:t>
             </w:r>
           </w:p>
         </w:tc>
@@ -4021,7 +3922,7 @@
                 <w:sz w:val="16"/>
                 <w:szCs w:val="16"/>
               </w:rPr>
-              <w:t xml:space="preserve">Acesso de outros sites</w:t>
+              <w:t xml:space="preserve">Páginas que exibem a API</w:t>
             </w:r>
           </w:p>
         </w:tc>
@@ -4052,7 +3953,7 @@
                 <w:sz w:val="16"/>
                 <w:szCs w:val="16"/>
               </w:rPr>
-              <w:t xml:space="preserve">CORS liberado para qualquer origem ("*")</w:t>
+              <w:t xml:space="preserve">Clickjacking (página colocada dentro de um iframe de outro site)</w:t>
             </w:r>
           </w:p>
         </w:tc>
@@ -4083,7 +3984,7 @@
                 <w:sz w:val="16"/>
                 <w:szCs w:val="16"/>
               </w:rPr>
-              <w:t xml:space="preserve">Sites de terceiros consumindo a API</w:t>
+              <w:t xml:space="preserve">Usuário clica em algo sem perceber</w:t>
             </w:r>
           </w:p>
         </w:tc>
@@ -4114,7 +4015,7 @@
                 <w:sz w:val="16"/>
                 <w:szCs w:val="16"/>
               </w:rPr>
-              <w:t xml:space="preserve">CORS liberado só para a origem do front-end do projeto, com métodos e headers definidos</w:t>
+              <w:t xml:space="preserve">Mantidos os cabeçalhos de segurança padrão do Spring Security, que bloqueiam o uso em iframe (X-Frame-Options)</w:t>
             </w:r>
           </w:p>
         </w:tc>
@@ -4183,7 +4084,7 @@
                 <w:sz w:val="16"/>
                 <w:szCs w:val="16"/>
               </w:rPr>
-              <w:t xml:space="preserve">Respostas de erro</w:t>
+              <w:t xml:space="preserve">Comunicação cliente–servidor</w:t>
             </w:r>
           </w:p>
         </w:tc>
@@ -4215,7 +4116,7 @@
                 <w:sz w:val="16"/>
                 <w:szCs w:val="16"/>
               </w:rPr>
-              <w:t xml:space="preserve">Stack trace, SQL ou nomes de classes no corpo da resposta</w:t>
+              <w:t xml:space="preserve">Interceptação do tráfego</w:t>
             </w:r>
           </w:p>
         </w:tc>
@@ -4247,7 +4148,7 @@
                 <w:sz w:val="16"/>
                 <w:szCs w:val="16"/>
               </w:rPr>
-              <w:t xml:space="preserve">Informações que ajudam um atacante</w:t>
+              <w:t xml:space="preserve">Captura da senha no login e do token</w:t>
             </w:r>
           </w:p>
         </w:tc>
@@ -4279,7 +4180,7 @@
                 <w:sz w:val="16"/>
                 <w:szCs w:val="16"/>
               </w:rPr>
-              <w:t xml:space="preserve">@RestControllerAdvice converte exceções (ex.: PastilhaNaoEncontradaException → 404) em JSON padronizado; server.error.include-stacktrace=never</w:t>
+              <w:t xml:space="preserve">HTTPS (SSL/TLS) em produção: o HTTPS protege o transporte</w:t>
             </w:r>
           </w:p>
         </w:tc>
@@ -4408,7 +4309,7 @@
                 <w:sz w:val="16"/>
                 <w:szCs w:val="16"/>
               </w:rPr>
-              <w:t xml:space="preserve">Comprometimento do banco e falsificação de tokens</w:t>
+              <w:t xml:space="preserve">Acesso ao banco e falsificação de tokens</w:t>
             </w:r>
           </w:p>
         </w:tc>
@@ -4439,7 +4340,7 @@
                 <w:sz w:val="16"/>
                 <w:szCs w:val="16"/>
               </w:rPr>
-              <w:t xml:space="preserve">Configuração externa do Spring Boot: spring.datasource.password=${DB_PASSWORD} e chave do token por variável de ambiente; .env no .gitignore</w:t>
+              <w:t xml:space="preserve">Configuração externa do Spring Boot: valores sensíveis lidos de variáveis de ambiente</w:t>
             </w:r>
           </w:p>
         </w:tc>
@@ -4508,7 +4409,7 @@
                 <w:sz w:val="16"/>
                 <w:szCs w:val="16"/>
               </w:rPr>
-              <w:t xml:space="preserve">Conexão com o PostgreSQL</w:t>
+              <w:t xml:space="preserve">Banco de dados e usuário inicial</w:t>
             </w:r>
           </w:p>
         </w:tc>
@@ -4540,7 +4441,7 @@
                 <w:sz w:val="16"/>
                 <w:szCs w:val="16"/>
               </w:rPr>
-              <w:t xml:space="preserve">Usuário do banco com poder demais (ex.: postgres)</w:t>
+              <w:t xml:space="preserve">Alterações manuais no esquema; Administrador criado sem controle</w:t>
             </w:r>
           </w:p>
         </w:tc>
@@ -4572,7 +4473,7 @@
                 <w:sz w:val="16"/>
                 <w:szCs w:val="16"/>
               </w:rPr>
-              <w:t xml:space="preserve">Um ataque bem-sucedido poderia apagar o banco inteiro</w:t>
+              <w:t xml:space="preserve">Ambientes diferentes entre si; conta admin insegura</w:t>
             </w:r>
           </w:p>
         </w:tc>
@@ -4604,7 +4505,7 @@
                 <w:sz w:val="16"/>
                 <w:szCs w:val="16"/>
               </w:rPr>
-              <w:t xml:space="preserve">Usuário próprio (ex.: estoque_user) só com permissão no banco da aplicação; esquema criado pelo Flyway; ddl-auto=validate e show-sql=false fora do ambiente de desenvolvimento</w:t>
+              <w:t xml:space="preserve">Tabela usuarios e Administrador inicial criados por migrações Flyway versionadas, com a senha já em hash BCrypt. Usuário próprio no PostgreSQL para a aplicação</w:t>
             </w:r>
           </w:p>
         </w:tc>
@@ -4671,7 +4572,7 @@
                 <w:sz w:val="16"/>
                 <w:szCs w:val="16"/>
               </w:rPr>
-              <w:t xml:space="preserve">Esquema do banco e usuário inicial</w:t>
+              <w:t xml:space="preserve">GET /pastilhas e /movimentacoes</w:t>
             </w:r>
           </w:p>
         </w:tc>
@@ -4702,7 +4603,7 @@
                 <w:sz w:val="16"/>
                 <w:szCs w:val="16"/>
               </w:rPr>
-              <w:t xml:space="preserve">Alterações manuais e sem histórico; admin criado com senha padrão</w:t>
+              <w:t xml:space="preserve">Pedir todos os registros de uma vez</w:t>
             </w:r>
           </w:p>
         </w:tc>
@@ -4733,7 +4634,7 @@
                 <w:sz w:val="16"/>
                 <w:szCs w:val="16"/>
               </w:rPr>
-              <w:t xml:space="preserve">Ambientes diferentes entre si; conta administrativa fácil de adivinhar</w:t>
+              <w:t xml:space="preserve">Lentidão da API</w:t>
             </w:r>
           </w:p>
         </w:tc>
@@ -4764,497 +4665,7 @@
                 <w:sz w:val="16"/>
                 <w:szCs w:val="16"/>
               </w:rPr>
-              <w:t xml:space="preserve">Migrações Flyway versionadas (V1__..., V2__...); o admin inicial é inserido por migração já com hash BCrypt e deve trocar a senha no primeiro acesso</w:t>
-            </w:r>
-          </w:p>
-        </w:tc>
-      </w:tr>
-      <w:tr>
-        <w:trPr>
-          <w:cantSplit/>
-        </w:trPr>
-        <w:tc>
-          <w:tcPr>
-            <w:tcW w:type="dxa" w:w="400"/>
-            <w:tcBorders>
-              <w:top w:val="single" w:color="A6B4C4" w:sz="4"/>
-              <w:left w:val="single" w:color="A6B4C4" w:sz="4"/>
-              <w:bottom w:val="single" w:color="A6B4C4" w:sz="4"/>
-              <w:right w:val="single" w:color="A6B4C4" w:sz="4"/>
-            </w:tcBorders>
-            <w:shd w:fill="F5F7FA" w:color="auto" w:val="clear"/>
-            <w:tcMar>
-              <w:top w:type="dxa" w:w="60"/>
-              <w:left w:type="dxa" w:w="90"/>
-              <w:bottom w:type="dxa" w:w="60"/>
-              <w:right w:type="dxa" w:w="90"/>
-            </w:tcMar>
-            <w:vAlign w:val="center"/>
-          </w:tcPr>
-          <w:p>
-            <w:pPr>
-              <w:jc w:val="center"/>
-            </w:pPr>
-            <w:r>
-              <w:rPr>
-                <w:rFonts w:ascii="Arial" w:cs="Arial" w:eastAsia="Arial" w:hAnsi="Arial"/>
-                <w:sz w:val="16"/>
-                <w:szCs w:val="16"/>
-              </w:rPr>
-              <w:t xml:space="preserve">18</w:t>
-            </w:r>
-          </w:p>
-        </w:tc>
-        <w:tc>
-          <w:tcPr>
-            <w:tcW w:type="dxa" w:w="1750"/>
-            <w:tcBorders>
-              <w:top w:val="single" w:color="A6B4C4" w:sz="4"/>
-              <w:left w:val="single" w:color="A6B4C4" w:sz="4"/>
-              <w:bottom w:val="single" w:color="A6B4C4" w:sz="4"/>
-              <w:right w:val="single" w:color="A6B4C4" w:sz="4"/>
-            </w:tcBorders>
-            <w:shd w:fill="F5F7FA" w:color="auto" w:val="clear"/>
-            <w:tcMar>
-              <w:top w:type="dxa" w:w="60"/>
-              <w:left w:type="dxa" w:w="90"/>
-              <w:bottom w:type="dxa" w:w="60"/>
-              <w:right w:type="dxa" w:w="90"/>
-            </w:tcMar>
-            <w:vAlign w:val="center"/>
-          </w:tcPr>
-          <w:p>
-            <w:pPr>
-              <w:jc w:val="left"/>
-            </w:pPr>
-            <w:r>
-              <w:rPr>
-                <w:rFonts w:ascii="Arial" w:cs="Arial" w:eastAsia="Arial" w:hAnsi="Arial"/>
-                <w:sz w:val="16"/>
-                <w:szCs w:val="16"/>
-              </w:rPr>
-              <w:t xml:space="preserve">GET /pastilhas e /movimentacoes</w:t>
-            </w:r>
-          </w:p>
-        </w:tc>
-        <w:tc>
-          <w:tcPr>
-            <w:tcW w:type="dxa" w:w="1950"/>
-            <w:tcBorders>
-              <w:top w:val="single" w:color="A6B4C4" w:sz="4"/>
-              <w:left w:val="single" w:color="A6B4C4" w:sz="4"/>
-              <w:bottom w:val="single" w:color="A6B4C4" w:sz="4"/>
-              <w:right w:val="single" w:color="A6B4C4" w:sz="4"/>
-            </w:tcBorders>
-            <w:shd w:fill="F5F7FA" w:color="auto" w:val="clear"/>
-            <w:tcMar>
-              <w:top w:type="dxa" w:w="60"/>
-              <w:left w:type="dxa" w:w="90"/>
-              <w:bottom w:type="dxa" w:w="60"/>
-              <w:right w:type="dxa" w:w="90"/>
-            </w:tcMar>
-            <w:vAlign w:val="center"/>
-          </w:tcPr>
-          <w:p>
-            <w:pPr>
-              <w:jc w:val="left"/>
-            </w:pPr>
-            <w:r>
-              <w:rPr>
-                <w:rFonts w:ascii="Arial" w:cs="Arial" w:eastAsia="Arial" w:hAnsi="Arial"/>
-                <w:sz w:val="16"/>
-                <w:szCs w:val="16"/>
-              </w:rPr>
-              <w:t xml:space="preserve">Pedir milhares de registros de uma vez</w:t>
-            </w:r>
-          </w:p>
-        </w:tc>
-        <w:tc>
-          <w:tcPr>
-            <w:tcW w:type="dxa" w:w="1738"/>
-            <w:tcBorders>
-              <w:top w:val="single" w:color="A6B4C4" w:sz="4"/>
-              <w:left w:val="single" w:color="A6B4C4" w:sz="4"/>
-              <w:bottom w:val="single" w:color="A6B4C4" w:sz="4"/>
-              <w:right w:val="single" w:color="A6B4C4" w:sz="4"/>
-            </w:tcBorders>
-            <w:shd w:fill="F5F7FA" w:color="auto" w:val="clear"/>
-            <w:tcMar>
-              <w:top w:type="dxa" w:w="60"/>
-              <w:left w:type="dxa" w:w="90"/>
-              <w:bottom w:type="dxa" w:w="60"/>
-              <w:right w:type="dxa" w:w="90"/>
-            </w:tcMar>
-            <w:vAlign w:val="center"/>
-          </w:tcPr>
-          <w:p>
-            <w:pPr>
-              <w:jc w:val="left"/>
-            </w:pPr>
-            <w:r>
-              <w:rPr>
-                <w:rFonts w:ascii="Arial" w:cs="Arial" w:eastAsia="Arial" w:hAnsi="Arial"/>
-                <w:sz w:val="16"/>
-                <w:szCs w:val="16"/>
-              </w:rPr>
-              <w:t xml:space="preserve">Lentidão ou queda da API</w:t>
-            </w:r>
-          </w:p>
-        </w:tc>
-        <w:tc>
-          <w:tcPr>
-            <w:tcW w:type="dxa" w:w="3800"/>
-            <w:tcBorders>
-              <w:top w:val="single" w:color="A6B4C4" w:sz="4"/>
-              <w:left w:val="single" w:color="A6B4C4" w:sz="4"/>
-              <w:bottom w:val="single" w:color="A6B4C4" w:sz="4"/>
-              <w:right w:val="single" w:color="A6B4C4" w:sz="4"/>
-            </w:tcBorders>
-            <w:shd w:fill="F5F7FA" w:color="auto" w:val="clear"/>
-            <w:tcMar>
-              <w:top w:type="dxa" w:w="60"/>
-              <w:left w:type="dxa" w:w="90"/>
-              <w:bottom w:type="dxa" w:w="60"/>
-              <w:right w:type="dxa" w:w="90"/>
-            </w:tcMar>
-            <w:vAlign w:val="center"/>
-          </w:tcPr>
-          <w:p>
-            <w:pPr>
-              <w:jc w:val="left"/>
-            </w:pPr>
-            <w:r>
-              <w:rPr>
-                <w:rFonts w:ascii="Arial" w:cs="Arial" w:eastAsia="Arial" w:hAnsi="Arial"/>
-                <w:sz w:val="16"/>
-                <w:szCs w:val="16"/>
-              </w:rPr>
-              <w:t xml:space="preserve">Paginação com Pageable e limite de 50 itens por página (spring.data.web.pageable.max-page-size=50)</w:t>
-            </w:r>
-          </w:p>
-        </w:tc>
-      </w:tr>
-      <w:tr>
-        <w:trPr>
-          <w:cantSplit/>
-        </w:trPr>
-        <w:tc>
-          <w:tcPr>
-            <w:tcW w:type="dxa" w:w="400"/>
-            <w:tcBorders>
-              <w:top w:val="single" w:color="A6B4C4" w:sz="4"/>
-              <w:left w:val="single" w:color="A6B4C4" w:sz="4"/>
-              <w:bottom w:val="single" w:color="A6B4C4" w:sz="4"/>
-              <w:right w:val="single" w:color="A6B4C4" w:sz="4"/>
-            </w:tcBorders>
-            <w:tcMar>
-              <w:top w:type="dxa" w:w="60"/>
-              <w:left w:type="dxa" w:w="90"/>
-              <w:bottom w:type="dxa" w:w="60"/>
-              <w:right w:type="dxa" w:w="90"/>
-            </w:tcMar>
-            <w:vAlign w:val="center"/>
-          </w:tcPr>
-          <w:p>
-            <w:pPr>
-              <w:jc w:val="center"/>
-            </w:pPr>
-            <w:r>
-              <w:rPr>
-                <w:rFonts w:ascii="Arial" w:cs="Arial" w:eastAsia="Arial" w:hAnsi="Arial"/>
-                <w:sz w:val="16"/>
-                <w:szCs w:val="16"/>
-              </w:rPr>
-              <w:t xml:space="preserve">19</w:t>
-            </w:r>
-          </w:p>
-        </w:tc>
-        <w:tc>
-          <w:tcPr>
-            <w:tcW w:type="dxa" w:w="1750"/>
-            <w:tcBorders>
-              <w:top w:val="single" w:color="A6B4C4" w:sz="4"/>
-              <w:left w:val="single" w:color="A6B4C4" w:sz="4"/>
-              <w:bottom w:val="single" w:color="A6B4C4" w:sz="4"/>
-              <w:right w:val="single" w:color="A6B4C4" w:sz="4"/>
-            </w:tcBorders>
-            <w:tcMar>
-              <w:top w:type="dxa" w:w="60"/>
-              <w:left w:type="dxa" w:w="90"/>
-              <w:bottom w:type="dxa" w:w="60"/>
-              <w:right w:type="dxa" w:w="90"/>
-            </w:tcMar>
-            <w:vAlign w:val="center"/>
-          </w:tcPr>
-          <w:p>
-            <w:pPr>
-              <w:jc w:val="left"/>
-            </w:pPr>
-            <w:r>
-              <w:rPr>
-                <w:rFonts w:ascii="Arial" w:cs="Arial" w:eastAsia="Arial" w:hAnsi="Arial"/>
-                <w:sz w:val="16"/>
-                <w:szCs w:val="16"/>
-              </w:rPr>
-              <w:t xml:space="preserve">/actuator e documentação</w:t>
-            </w:r>
-          </w:p>
-        </w:tc>
-        <w:tc>
-          <w:tcPr>
-            <w:tcW w:type="dxa" w:w="1950"/>
-            <w:tcBorders>
-              <w:top w:val="single" w:color="A6B4C4" w:sz="4"/>
-              <w:left w:val="single" w:color="A6B4C4" w:sz="4"/>
-              <w:bottom w:val="single" w:color="A6B4C4" w:sz="4"/>
-              <w:right w:val="single" w:color="A6B4C4" w:sz="4"/>
-            </w:tcBorders>
-            <w:tcMar>
-              <w:top w:type="dxa" w:w="60"/>
-              <w:left w:type="dxa" w:w="90"/>
-              <w:bottom w:type="dxa" w:w="60"/>
-              <w:right w:type="dxa" w:w="90"/>
-            </w:tcMar>
-            <w:vAlign w:val="center"/>
-          </w:tcPr>
-          <w:p>
-            <w:pPr>
-              <w:jc w:val="left"/>
-            </w:pPr>
-            <w:r>
-              <w:rPr>
-                <w:rFonts w:ascii="Arial" w:cs="Arial" w:eastAsia="Arial" w:hAnsi="Arial"/>
-                <w:sz w:val="16"/>
-                <w:szCs w:val="16"/>
-              </w:rPr>
-              <w:t xml:space="preserve">Exposição de informações internas (beans, variáveis, configurações)</w:t>
-            </w:r>
-          </w:p>
-        </w:tc>
-        <w:tc>
-          <w:tcPr>
-            <w:tcW w:type="dxa" w:w="1738"/>
-            <w:tcBorders>
-              <w:top w:val="single" w:color="A6B4C4" w:sz="4"/>
-              <w:left w:val="single" w:color="A6B4C4" w:sz="4"/>
-              <w:bottom w:val="single" w:color="A6B4C4" w:sz="4"/>
-              <w:right w:val="single" w:color="A6B4C4" w:sz="4"/>
-            </w:tcBorders>
-            <w:tcMar>
-              <w:top w:type="dxa" w:w="60"/>
-              <w:left w:type="dxa" w:w="90"/>
-              <w:bottom w:type="dxa" w:w="60"/>
-              <w:right w:type="dxa" w:w="90"/>
-            </w:tcMar>
-            <w:vAlign w:val="center"/>
-          </w:tcPr>
-          <w:p>
-            <w:pPr>
-              <w:jc w:val="left"/>
-            </w:pPr>
-            <w:r>
-              <w:rPr>
-                <w:rFonts w:ascii="Arial" w:cs="Arial" w:eastAsia="Arial" w:hAnsi="Arial"/>
-                <w:sz w:val="16"/>
-                <w:szCs w:val="16"/>
-              </w:rPr>
-              <w:t xml:space="preserve">Mapeamento facilitado da aplicação</w:t>
-            </w:r>
-          </w:p>
-        </w:tc>
-        <w:tc>
-          <w:tcPr>
-            <w:tcW w:type="dxa" w:w="3800"/>
-            <w:tcBorders>
-              <w:top w:val="single" w:color="A6B4C4" w:sz="4"/>
-              <w:left w:val="single" w:color="A6B4C4" w:sz="4"/>
-              <w:bottom w:val="single" w:color="A6B4C4" w:sz="4"/>
-              <w:right w:val="single" w:color="A6B4C4" w:sz="4"/>
-            </w:tcBorders>
-            <w:tcMar>
-              <w:top w:type="dxa" w:w="60"/>
-              <w:left w:type="dxa" w:w="90"/>
-              <w:bottom w:type="dxa" w:w="60"/>
-              <w:right w:type="dxa" w:w="90"/>
-            </w:tcMar>
-            <w:vAlign w:val="center"/>
-          </w:tcPr>
-          <w:p>
-            <w:pPr>
-              <w:jc w:val="left"/>
-            </w:pPr>
-            <w:r>
-              <w:rPr>
-                <w:rFonts w:ascii="Arial" w:cs="Arial" w:eastAsia="Arial" w:hAnsi="Arial"/>
-                <w:sz w:val="16"/>
-                <w:szCs w:val="16"/>
-              </w:rPr>
-              <w:t xml:space="preserve">Apenas /actuator/health exposto (management.endpoints.web.exposure.include=health)</w:t>
-            </w:r>
-          </w:p>
-        </w:tc>
-      </w:tr>
-      <w:tr>
-        <w:trPr>
-          <w:cantSplit/>
-        </w:trPr>
-        <w:tc>
-          <w:tcPr>
-            <w:tcW w:type="dxa" w:w="400"/>
-            <w:tcBorders>
-              <w:top w:val="single" w:color="A6B4C4" w:sz="4"/>
-              <w:left w:val="single" w:color="A6B4C4" w:sz="4"/>
-              <w:bottom w:val="single" w:color="A6B4C4" w:sz="4"/>
-              <w:right w:val="single" w:color="A6B4C4" w:sz="4"/>
-            </w:tcBorders>
-            <w:shd w:fill="F5F7FA" w:color="auto" w:val="clear"/>
-            <w:tcMar>
-              <w:top w:type="dxa" w:w="60"/>
-              <w:left w:type="dxa" w:w="90"/>
-              <w:bottom w:type="dxa" w:w="60"/>
-              <w:right w:type="dxa" w:w="90"/>
-            </w:tcMar>
-            <w:vAlign w:val="center"/>
-          </w:tcPr>
-          <w:p>
-            <w:pPr>
-              <w:jc w:val="center"/>
-            </w:pPr>
-            <w:r>
-              <w:rPr>
-                <w:rFonts w:ascii="Arial" w:cs="Arial" w:eastAsia="Arial" w:hAnsi="Arial"/>
-                <w:sz w:val="16"/>
-                <w:szCs w:val="16"/>
-              </w:rPr>
-              <w:t xml:space="preserve">20</w:t>
-            </w:r>
-          </w:p>
-        </w:tc>
-        <w:tc>
-          <w:tcPr>
-            <w:tcW w:type="dxa" w:w="1750"/>
-            <w:tcBorders>
-              <w:top w:val="single" w:color="A6B4C4" w:sz="4"/>
-              <w:left w:val="single" w:color="A6B4C4" w:sz="4"/>
-              <w:bottom w:val="single" w:color="A6B4C4" w:sz="4"/>
-              <w:right w:val="single" w:color="A6B4C4" w:sz="4"/>
-            </w:tcBorders>
-            <w:shd w:fill="F5F7FA" w:color="auto" w:val="clear"/>
-            <w:tcMar>
-              <w:top w:type="dxa" w:w="60"/>
-              <w:left w:type="dxa" w:w="90"/>
-              <w:bottom w:type="dxa" w:w="60"/>
-              <w:right w:type="dxa" w:w="90"/>
-            </w:tcMar>
-            <w:vAlign w:val="center"/>
-          </w:tcPr>
-          <w:p>
-            <w:pPr>
-              <w:jc w:val="left"/>
-            </w:pPr>
-            <w:r>
-              <w:rPr>
-                <w:rFonts w:ascii="Arial" w:cs="Arial" w:eastAsia="Arial" w:hAnsi="Arial"/>
-                <w:sz w:val="16"/>
-                <w:szCs w:val="16"/>
-              </w:rPr>
-              <w:t xml:space="preserve">Histórico de movimentações</w:t>
-            </w:r>
-          </w:p>
-        </w:tc>
-        <w:tc>
-          <w:tcPr>
-            <w:tcW w:type="dxa" w:w="1950"/>
-            <w:tcBorders>
-              <w:top w:val="single" w:color="A6B4C4" w:sz="4"/>
-              <w:left w:val="single" w:color="A6B4C4" w:sz="4"/>
-              <w:bottom w:val="single" w:color="A6B4C4" w:sz="4"/>
-              <w:right w:val="single" w:color="A6B4C4" w:sz="4"/>
-            </w:tcBorders>
-            <w:shd w:fill="F5F7FA" w:color="auto" w:val="clear"/>
-            <w:tcMar>
-              <w:top w:type="dxa" w:w="60"/>
-              <w:left w:type="dxa" w:w="90"/>
-              <w:bottom w:type="dxa" w:w="60"/>
-              <w:right w:type="dxa" w:w="90"/>
-            </w:tcMar>
-            <w:vAlign w:val="center"/>
-          </w:tcPr>
-          <w:p>
-            <w:pPr>
-              <w:jc w:val="left"/>
-            </w:pPr>
-            <w:r>
-              <w:rPr>
-                <w:rFonts w:ascii="Arial" w:cs="Arial" w:eastAsia="Arial" w:hAnsi="Arial"/>
-                <w:sz w:val="16"/>
-                <w:szCs w:val="16"/>
-              </w:rPr>
-              <w:t xml:space="preserve">Usuário nega ter feito uma retirada; registro apagado ou editado</w:t>
-            </w:r>
-          </w:p>
-        </w:tc>
-        <w:tc>
-          <w:tcPr>
-            <w:tcW w:type="dxa" w:w="1738"/>
-            <w:tcBorders>
-              <w:top w:val="single" w:color="A6B4C4" w:sz="4"/>
-              <w:left w:val="single" w:color="A6B4C4" w:sz="4"/>
-              <w:bottom w:val="single" w:color="A6B4C4" w:sz="4"/>
-              <w:right w:val="single" w:color="A6B4C4" w:sz="4"/>
-            </w:tcBorders>
-            <w:shd w:fill="F5F7FA" w:color="auto" w:val="clear"/>
-            <w:tcMar>
-              <w:top w:type="dxa" w:w="60"/>
-              <w:left w:type="dxa" w:w="90"/>
-              <w:bottom w:type="dxa" w:w="60"/>
-              <w:right w:type="dxa" w:w="90"/>
-            </w:tcMar>
-            <w:vAlign w:val="center"/>
-          </w:tcPr>
-          <w:p>
-            <w:pPr>
-              <w:jc w:val="left"/>
-            </w:pPr>
-            <w:r>
-              <w:rPr>
-                <w:rFonts w:ascii="Arial" w:cs="Arial" w:eastAsia="Arial" w:hAnsi="Arial"/>
-                <w:sz w:val="16"/>
-                <w:szCs w:val="16"/>
-              </w:rPr>
-              <w:t xml:space="preserve">Perdas de estoque sem explicação</w:t>
-            </w:r>
-          </w:p>
-        </w:tc>
-        <w:tc>
-          <w:tcPr>
-            <w:tcW w:type="dxa" w:w="3800"/>
-            <w:tcBorders>
-              <w:top w:val="single" w:color="A6B4C4" w:sz="4"/>
-              <w:left w:val="single" w:color="A6B4C4" w:sz="4"/>
-              <w:bottom w:val="single" w:color="A6B4C4" w:sz="4"/>
-              <w:right w:val="single" w:color="A6B4C4" w:sz="4"/>
-            </w:tcBorders>
-            <w:shd w:fill="F5F7FA" w:color="auto" w:val="clear"/>
-            <w:tcMar>
-              <w:top w:type="dxa" w:w="60"/>
-              <w:left w:type="dxa" w:w="90"/>
-              <w:bottom w:type="dxa" w:w="60"/>
-              <w:right w:type="dxa" w:w="90"/>
-            </w:tcMar>
-            <w:vAlign w:val="center"/>
-          </w:tcPr>
-          <w:p>
-            <w:pPr>
-              <w:jc w:val="left"/>
-            </w:pPr>
-            <w:r>
-              <w:rPr>
-                <w:rFonts w:ascii="Arial" w:cs="Arial" w:eastAsia="Arial" w:hAnsi="Arial"/>
-                <w:sz w:val="16"/>
-                <w:szCs w:val="16"/>
-              </w:rPr>
-              <w:t xml:space="preserve">Movimentação não tem PUT nem DELETE, só estorno pelo Administrador; cada registro guarda usuário e data/hora</w:t>
+              <w:t xml:space="preserve">Listagens paginadas com Pageable</w:t>
             </w:r>
           </w:p>
         </w:tc>
@@ -5263,7 +4674,6 @@
     <w:p>
       <w:pPr>
         <w:pStyle w:val="Heading1"/>
-        <w:spacing w:after="160" w:before="300"/>
       </w:pPr>
       <w:r>
         <w:t xml:space="preserve">2. Plano de Segurança da API</w:t>
@@ -5272,7 +4682,6 @@
     <w:p>
       <w:pPr>
         <w:pStyle w:val="Heading2"/>
-        <w:spacing w:after="100" w:before="220"/>
       </w:pPr>
       <w:r>
         <w:t xml:space="preserve">2.1 Como será realizada a autenticação</w:t>
@@ -5293,7 +4702,7 @@
           <w:sz w:val="21"/>
           <w:szCs w:val="21"/>
         </w:rPr>
-        <w:t xml:space="preserve">Será usado o </w:t>
+        <w:t xml:space="preserve">Com </w:t>
       </w:r>
       <w:r>
         <w:rPr>
@@ -5311,7 +4720,7 @@
           <w:sz w:val="21"/>
           <w:szCs w:val="21"/>
         </w:rPr>
-        <w:t xml:space="preserve"> com autenticação </w:t>
+        <w:t xml:space="preserve"> e </w:t>
       </w:r>
       <w:r>
         <w:rPr>
@@ -5321,7 +4730,7 @@
           <w:sz w:val="21"/>
           <w:szCs w:val="21"/>
         </w:rPr>
-        <w:t xml:space="preserve">por token JWT</w:t>
+        <w:t xml:space="preserve">token JWT</w:t>
       </w:r>
       <w:r>
         <w:rPr>
@@ -5329,7 +4738,25 @@
           <w:sz w:val="21"/>
           <w:szCs w:val="21"/>
         </w:rPr>
-        <w:t xml:space="preserve">, sem sessão no servidor (SessionCreationPolicy.STATELESS).</w:t>
+        <w:t xml:space="preserve">, no modelo da Aula 10. A API é </w:t>
+      </w:r>
+      <w:r>
+        <w:rPr>
+          <w:rFonts w:ascii="Arial" w:cs="Arial" w:eastAsia="Arial" w:hAnsi="Arial"/>
+          <w:b/>
+          <w:bCs/>
+          <w:sz w:val="21"/>
+          <w:szCs w:val="21"/>
+        </w:rPr>
+        <w:t xml:space="preserve">stateless</w:t>
+      </w:r>
+      <w:r>
+        <w:rPr>
+          <w:rFonts w:ascii="Arial" w:cs="Arial" w:eastAsia="Arial" w:hAnsi="Arial"/>
+          <w:sz w:val="21"/>
+          <w:szCs w:val="21"/>
+        </w:rPr>
+        <w:t xml:space="preserve">: não guarda sessão, o cliente envia o token em cada requisição.</w:t>
       </w:r>
     </w:p>
     <w:p>
@@ -5344,10 +4771,20 @@
       <w:r>
         <w:rPr>
           <w:rFonts w:ascii="Arial" w:cs="Arial" w:eastAsia="Arial" w:hAnsi="Arial"/>
+          <w:b/>
+          <w:bCs/>
           <w:sz w:val="21"/>
           <w:szCs w:val="21"/>
         </w:rPr>
-        <w:t xml:space="preserve">O cliente envia login e senha em </w:t>
+        <w:t xml:space="preserve">POST /auth/register</w:t>
+      </w:r>
+      <w:r>
+        <w:rPr>
+          <w:rFonts w:ascii="Arial" w:cs="Arial" w:eastAsia="Arial" w:hAnsi="Arial"/>
+          <w:sz w:val="21"/>
+          <w:szCs w:val="21"/>
+        </w:rPr>
+        <w:t xml:space="preserve"> cadastra o usuário e guarda o </w:t>
       </w:r>
       <w:r>
         <w:rPr>
@@ -5357,7 +4794,7 @@
           <w:sz w:val="21"/>
           <w:szCs w:val="21"/>
         </w:rPr>
-        <w:t xml:space="preserve">POST /auth/login</w:t>
+        <w:t xml:space="preserve">hash</w:t>
       </w:r>
       <w:r>
         <w:rPr>
@@ -5365,7 +4802,7 @@
           <w:sz w:val="21"/>
           <w:szCs w:val="21"/>
         </w:rPr>
-        <w:t xml:space="preserve">. O Spring Security busca o usuário no PostgreSQL (UsuarioRepository.findByLogin) e compara a senha com o hash BCrypt.</w:t>
+        <w:t xml:space="preserve"> da senha.</w:t>
       </w:r>
     </w:p>
     <w:p>
@@ -5380,20 +4817,12 @@
       <w:r>
         <w:rPr>
           <w:rFonts w:ascii="Arial" w:cs="Arial" w:eastAsia="Arial" w:hAnsi="Arial"/>
-          <w:sz w:val="21"/>
-          <w:szCs w:val="21"/>
-        </w:rPr>
-        <w:t xml:space="preserve">Se estiver correto, a API responde </w:t>
-      </w:r>
-      <w:r>
-        <w:rPr>
-          <w:rFonts w:ascii="Arial" w:cs="Arial" w:eastAsia="Arial" w:hAnsi="Arial"/>
           <w:b/>
           <w:bCs/>
           <w:sz w:val="21"/>
           <w:szCs w:val="21"/>
         </w:rPr>
-        <w:t xml:space="preserve">200 OK</w:t>
+        <w:t xml:space="preserve">POST /auth/login</w:t>
       </w:r>
       <w:r>
         <w:rPr>
@@ -5401,43 +4830,7 @@
           <w:sz w:val="21"/>
           <w:szCs w:val="21"/>
         </w:rPr>
-        <w:t xml:space="preserve"> com um token que contém o login, o perfil e a validade (</w:t>
-      </w:r>
-      <w:r>
-        <w:rPr>
-          <w:rFonts w:ascii="Arial" w:cs="Arial" w:eastAsia="Arial" w:hAnsi="Arial"/>
-          <w:b/>
-          <w:bCs/>
-          <w:sz w:val="21"/>
-          <w:szCs w:val="21"/>
-        </w:rPr>
-        <w:t xml:space="preserve">1 hora</w:t>
-      </w:r>
-      <w:r>
-        <w:rPr>
-          <w:rFonts w:ascii="Arial" w:cs="Arial" w:eastAsia="Arial" w:hAnsi="Arial"/>
-          <w:sz w:val="21"/>
-          <w:szCs w:val="21"/>
-        </w:rPr>
-        <w:t xml:space="preserve">). Se não estiver, responde </w:t>
-      </w:r>
-      <w:r>
-        <w:rPr>
-          <w:rFonts w:ascii="Arial" w:cs="Arial" w:eastAsia="Arial" w:hAnsi="Arial"/>
-          <w:b/>
-          <w:bCs/>
-          <w:sz w:val="21"/>
-          <w:szCs w:val="21"/>
-        </w:rPr>
-        <w:t xml:space="preserve">401</w:t>
-      </w:r>
-      <w:r>
-        <w:rPr>
-          <w:rFonts w:ascii="Arial" w:cs="Arial" w:eastAsia="Arial" w:hAnsi="Arial"/>
-          <w:sz w:val="21"/>
-          <w:szCs w:val="21"/>
-        </w:rPr>
-        <w:t xml:space="preserve">.</w:t>
+        <w:t xml:space="preserve"> recebe e-mail e senha. O AuthenticationManager delega ao UserDetailsService, que busca o usuário no PostgreSQL (repository.findByEmail), e ao PasswordEncoder, que compara a senha com o hash.</w:t>
       </w:r>
     </w:p>
     <w:p>
@@ -5455,7 +4848,7 @@
           <w:sz w:val="21"/>
           <w:szCs w:val="21"/>
         </w:rPr>
-        <w:t xml:space="preserve">Nas demais requisições o cliente envia o header </w:t>
+        <w:t xml:space="preserve">Se estiver certo, o tokenService gera o </w:t>
       </w:r>
       <w:r>
         <w:rPr>
@@ -5465,7 +4858,7 @@
           <w:sz w:val="21"/>
           <w:szCs w:val="21"/>
         </w:rPr>
-        <w:t xml:space="preserve">Authorization: Bearer &lt;token&gt;</w:t>
+        <w:t xml:space="preserve">JWT</w:t>
       </w:r>
       <w:r>
         <w:rPr>
@@ -5473,7 +4866,25 @@
           <w:sz w:val="21"/>
           <w:szCs w:val="21"/>
         </w:rPr>
-        <w:t xml:space="preserve">. Um filtro valida o token antes de a requisição chegar ao Controller.</w:t>
+        <w:t xml:space="preserve"> com sub (e-mail), iat, exp e o perfil, e a API devolve o token. Se estiver errado, responde </w:t>
+      </w:r>
+      <w:r>
+        <w:rPr>
+          <w:rFonts w:ascii="Arial" w:cs="Arial" w:eastAsia="Arial" w:hAnsi="Arial"/>
+          <w:b/>
+          <w:bCs/>
+          <w:sz w:val="21"/>
+          <w:szCs w:val="21"/>
+        </w:rPr>
+        <w:t xml:space="preserve">401</w:t>
+      </w:r>
+      <w:r>
+        <w:rPr>
+          <w:rFonts w:ascii="Arial" w:cs="Arial" w:eastAsia="Arial" w:hAnsi="Arial"/>
+          <w:sz w:val="21"/>
+          <w:szCs w:val="21"/>
+        </w:rPr>
+        <w:t xml:space="preserve">.</w:t>
       </w:r>
     </w:p>
     <w:p>
@@ -5491,16 +4902,25 @@
           <w:sz w:val="21"/>
           <w:szCs w:val="21"/>
         </w:rPr>
-        <w:t xml:space="preserve">Usuário inativo não autentica. Após 5 tentativas erradas seguidas, a conta fica bloqueada por 15 minutos.</w:t>
-      </w:r>
-    </w:p>
-    <w:p>
-      <w:pPr>
-        <w:pStyle w:val="Heading2"/>
-        <w:spacing w:after="100" w:before="220"/>
-      </w:pPr>
-      <w:r>
-        <w:t xml:space="preserve">2.2 Recursos acessíveis sem autenticação</w:t>
+        <w:t xml:space="preserve">Nas outras requisições o cliente envia </w:t>
+      </w:r>
+      <w:r>
+        <w:rPr>
+          <w:rFonts w:ascii="Arial" w:cs="Arial" w:eastAsia="Arial" w:hAnsi="Arial"/>
+          <w:b/>
+          <w:bCs/>
+          <w:sz w:val="21"/>
+          <w:szCs w:val="21"/>
+        </w:rPr>
+        <w:t xml:space="preserve">Authorization: Bearer &lt;token&gt;</w:t>
+      </w:r>
+      <w:r>
+        <w:rPr>
+          <w:rFonts w:ascii="Arial" w:cs="Arial" w:eastAsia="Arial" w:hAnsi="Arial"/>
+          <w:sz w:val="21"/>
+          <w:szCs w:val="21"/>
+        </w:rPr>
+        <w:t xml:space="preserve">. O token é validado na cadeia de filtros, antes do Controller.</w:t>
       </w:r>
     </w:p>
     <w:p>
@@ -5515,20 +4935,18 @@
       <w:r>
         <w:rPr>
           <w:rFonts w:ascii="Arial" w:cs="Arial" w:eastAsia="Arial" w:hAnsi="Arial"/>
-          <w:b/>
-          <w:bCs/>
           <w:sz w:val="21"/>
           <w:szCs w:val="21"/>
         </w:rPr>
-        <w:t xml:space="preserve">POST /auth/login</w:t>
-      </w:r>
-      <w:r>
-        <w:rPr>
-          <w:rFonts w:ascii="Arial" w:cs="Arial" w:eastAsia="Arial" w:hAnsi="Arial"/>
-          <w:sz w:val="21"/>
-          <w:szCs w:val="21"/>
-        </w:rPr>
-        <w:t xml:space="preserve">: necessário para obter o token.</w:t>
+        <w:t xml:space="preserve">Usuário com ativo = false não consegue fazer login.</w:t>
+      </w:r>
+    </w:p>
+    <w:p>
+      <w:pPr>
+        <w:pStyle w:val="Heading2"/>
+      </w:pPr>
+      <w:r>
+        <w:t xml:space="preserve">2.2 Recursos acessíveis sem autenticação</w:t>
       </w:r>
     </w:p>
     <w:p>
@@ -5548,7 +4966,7 @@
           <w:sz w:val="21"/>
           <w:szCs w:val="21"/>
         </w:rPr>
-        <w:t xml:space="preserve">GET /actuator/health</w:t>
+        <w:t xml:space="preserve">POST /auth/register</w:t>
       </w:r>
       <w:r>
         <w:rPr>
@@ -5556,159 +4974,7 @@
           <w:sz w:val="21"/>
           <w:szCs w:val="21"/>
         </w:rPr>
-        <w:t xml:space="preserve">: apenas informa se a API está no ar.</w:t>
-      </w:r>
-    </w:p>
-    <w:p>
-      <w:pPr>
-        <w:spacing w:after="120" w:line="276"/>
-      </w:pPr>
-      <w:r>
-        <w:rPr>
-          <w:rFonts w:ascii="Arial" w:cs="Arial" w:eastAsia="Arial" w:hAnsi="Arial"/>
-          <w:sz w:val="21"/>
-          <w:szCs w:val="21"/>
-        </w:rPr>
-        <w:t xml:space="preserve">Não haverá cadastro público de usuários: contas são criadas somente pelo Administrador.</w:t>
-      </w:r>
-    </w:p>
-    <w:p>
-      <w:pPr>
-        <w:pStyle w:val="Heading2"/>
-        <w:spacing w:after="100" w:before="220"/>
-      </w:pPr>
-      <w:r>
-        <w:t xml:space="preserve">2.3 Recursos protegidos</w:t>
-      </w:r>
-    </w:p>
-    <w:p>
-      <w:pPr>
-        <w:spacing w:after="120" w:line="276"/>
-      </w:pPr>
-      <w:r>
-        <w:rPr>
-          <w:rFonts w:ascii="Arial" w:cs="Arial" w:eastAsia="Arial" w:hAnsi="Arial"/>
-          <w:sz w:val="21"/>
-          <w:szCs w:val="21"/>
-        </w:rPr>
-        <w:t xml:space="preserve">Todos os outros: </w:t>
-      </w:r>
-      <w:r>
-        <w:rPr>
-          <w:rFonts w:ascii="Arial" w:cs="Arial" w:eastAsia="Arial" w:hAnsi="Arial"/>
-          <w:b/>
-          <w:bCs/>
-          <w:sz w:val="21"/>
-          <w:szCs w:val="21"/>
-        </w:rPr>
-        <w:t xml:space="preserve">/pastilhas</w:t>
-      </w:r>
-      <w:r>
-        <w:rPr>
-          <w:rFonts w:ascii="Arial" w:cs="Arial" w:eastAsia="Arial" w:hAnsi="Arial"/>
-          <w:sz w:val="21"/>
-          <w:szCs w:val="21"/>
-        </w:rPr>
-        <w:t xml:space="preserve">, </w:t>
-      </w:r>
-      <w:r>
-        <w:rPr>
-          <w:rFonts w:ascii="Arial" w:cs="Arial" w:eastAsia="Arial" w:hAnsi="Arial"/>
-          <w:b/>
-          <w:bCs/>
-          <w:sz w:val="21"/>
-          <w:szCs w:val="21"/>
-        </w:rPr>
-        <w:t xml:space="preserve">/fornecedores</w:t>
-      </w:r>
-      <w:r>
-        <w:rPr>
-          <w:rFonts w:ascii="Arial" w:cs="Arial" w:eastAsia="Arial" w:hAnsi="Arial"/>
-          <w:sz w:val="21"/>
-          <w:szCs w:val="21"/>
-        </w:rPr>
-        <w:t xml:space="preserve">, </w:t>
-      </w:r>
-      <w:r>
-        <w:rPr>
-          <w:rFonts w:ascii="Arial" w:cs="Arial" w:eastAsia="Arial" w:hAnsi="Arial"/>
-          <w:b/>
-          <w:bCs/>
-          <w:sz w:val="21"/>
-          <w:szCs w:val="21"/>
-        </w:rPr>
-        <w:t xml:space="preserve">/movimentacoes</w:t>
-      </w:r>
-      <w:r>
-        <w:rPr>
-          <w:rFonts w:ascii="Arial" w:cs="Arial" w:eastAsia="Arial" w:hAnsi="Arial"/>
-          <w:sz w:val="21"/>
-          <w:szCs w:val="21"/>
-        </w:rPr>
-        <w:t xml:space="preserve"> e </w:t>
-      </w:r>
-      <w:r>
-        <w:rPr>
-          <w:rFonts w:ascii="Arial" w:cs="Arial" w:eastAsia="Arial" w:hAnsi="Arial"/>
-          <w:b/>
-          <w:bCs/>
-          <w:sz w:val="21"/>
-          <w:szCs w:val="21"/>
-        </w:rPr>
-        <w:t xml:space="preserve">/usuarios</w:t>
-      </w:r>
-      <w:r>
-        <w:rPr>
-          <w:rFonts w:ascii="Arial" w:cs="Arial" w:eastAsia="Arial" w:hAnsi="Arial"/>
-          <w:sz w:val="21"/>
-          <w:szCs w:val="21"/>
-        </w:rPr>
-        <w:t xml:space="preserve">. Sem token válido a API responde </w:t>
-      </w:r>
-      <w:r>
-        <w:rPr>
-          <w:rFonts w:ascii="Arial" w:cs="Arial" w:eastAsia="Arial" w:hAnsi="Arial"/>
-          <w:b/>
-          <w:bCs/>
-          <w:sz w:val="21"/>
-          <w:szCs w:val="21"/>
-        </w:rPr>
-        <w:t xml:space="preserve">401 Unauthorized</w:t>
-      </w:r>
-      <w:r>
-        <w:rPr>
-          <w:rFonts w:ascii="Arial" w:cs="Arial" w:eastAsia="Arial" w:hAnsi="Arial"/>
-          <w:sz w:val="21"/>
-          <w:szCs w:val="21"/>
-        </w:rPr>
-        <w:t xml:space="preserve">; com token, mas sem o perfil necessário, responde </w:t>
-      </w:r>
-      <w:r>
-        <w:rPr>
-          <w:rFonts w:ascii="Arial" w:cs="Arial" w:eastAsia="Arial" w:hAnsi="Arial"/>
-          <w:b/>
-          <w:bCs/>
-          <w:sz w:val="21"/>
-          <w:szCs w:val="21"/>
-        </w:rPr>
-        <w:t xml:space="preserve">403 Forbidden</w:t>
-      </w:r>
-      <w:r>
-        <w:rPr>
-          <w:rFonts w:ascii="Arial" w:cs="Arial" w:eastAsia="Arial" w:hAnsi="Arial"/>
-          <w:sz w:val="21"/>
-          <w:szCs w:val="21"/>
-        </w:rPr>
-        <w:t xml:space="preserve">. Rotas não previstas são negadas (denyAll).</w:t>
-      </w:r>
-    </w:p>
-    <w:p>
-      <w:pPr>
-        <w:pStyle w:val="Heading2"/>
-        <w:spacing w:after="100" w:before="220"/>
-      </w:pPr>
-      <w:r>
-        <w:t xml:space="preserve">2.4 Perfis de acesso</w:t>
+        <w:t xml:space="preserve">: cadastro de usuário (sempre com perfil USUARIO).</w:t>
       </w:r>
     </w:p>
     <w:p>
@@ -5728,7 +4994,7 @@
           <w:sz w:val="21"/>
           <w:szCs w:val="21"/>
         </w:rPr>
-        <w:t xml:space="preserve">Público</w:t>
+        <w:t xml:space="preserve">POST /auth/login</w:t>
       </w:r>
       <w:r>
         <w:rPr>
@@ -5736,7 +5002,157 @@
           <w:sz w:val="21"/>
           <w:szCs w:val="21"/>
         </w:rPr>
-        <w:t xml:space="preserve">: quem ainda não fez login. Só acessa login e health.</w:t>
+        <w:t xml:space="preserve">: obter o token.</w:t>
+      </w:r>
+    </w:p>
+    <w:p>
+      <w:pPr>
+        <w:spacing w:after="120" w:line="276"/>
+      </w:pPr>
+      <w:r>
+        <w:rPr>
+          <w:rFonts w:ascii="Arial" w:cs="Arial" w:eastAsia="Arial" w:hAnsi="Arial"/>
+          <w:sz w:val="21"/>
+          <w:szCs w:val="21"/>
+        </w:rPr>
+        <w:t xml:space="preserve">No SecurityFilterChain: requestMatchers("/auth/**").permitAll().</w:t>
+      </w:r>
+    </w:p>
+    <w:p>
+      <w:pPr>
+        <w:pStyle w:val="Heading2"/>
+      </w:pPr>
+      <w:r>
+        <w:t xml:space="preserve">2.3 Recursos protegidos</w:t>
+      </w:r>
+    </w:p>
+    <w:p>
+      <w:pPr>
+        <w:spacing w:after="120" w:line="276"/>
+      </w:pPr>
+      <w:r>
+        <w:rPr>
+          <w:rFonts w:ascii="Arial" w:cs="Arial" w:eastAsia="Arial" w:hAnsi="Arial"/>
+          <w:sz w:val="21"/>
+          <w:szCs w:val="21"/>
+        </w:rPr>
+        <w:t xml:space="preserve">Todos os outros: </w:t>
+      </w:r>
+      <w:r>
+        <w:rPr>
+          <w:rFonts w:ascii="Arial" w:cs="Arial" w:eastAsia="Arial" w:hAnsi="Arial"/>
+          <w:b/>
+          <w:bCs/>
+          <w:sz w:val="21"/>
+          <w:szCs w:val="21"/>
+        </w:rPr>
+        <w:t xml:space="preserve">/pastilhas</w:t>
+      </w:r>
+      <w:r>
+        <w:rPr>
+          <w:rFonts w:ascii="Arial" w:cs="Arial" w:eastAsia="Arial" w:hAnsi="Arial"/>
+          <w:sz w:val="21"/>
+          <w:szCs w:val="21"/>
+        </w:rPr>
+        <w:t xml:space="preserve">, </w:t>
+      </w:r>
+      <w:r>
+        <w:rPr>
+          <w:rFonts w:ascii="Arial" w:cs="Arial" w:eastAsia="Arial" w:hAnsi="Arial"/>
+          <w:b/>
+          <w:bCs/>
+          <w:sz w:val="21"/>
+          <w:szCs w:val="21"/>
+        </w:rPr>
+        <w:t xml:space="preserve">/fornecedores</w:t>
+      </w:r>
+      <w:r>
+        <w:rPr>
+          <w:rFonts w:ascii="Arial" w:cs="Arial" w:eastAsia="Arial" w:hAnsi="Arial"/>
+          <w:sz w:val="21"/>
+          <w:szCs w:val="21"/>
+        </w:rPr>
+        <w:t xml:space="preserve">, </w:t>
+      </w:r>
+      <w:r>
+        <w:rPr>
+          <w:rFonts w:ascii="Arial" w:cs="Arial" w:eastAsia="Arial" w:hAnsi="Arial"/>
+          <w:b/>
+          <w:bCs/>
+          <w:sz w:val="21"/>
+          <w:szCs w:val="21"/>
+        </w:rPr>
+        <w:t xml:space="preserve">/movimentacoes</w:t>
+      </w:r>
+      <w:r>
+        <w:rPr>
+          <w:rFonts w:ascii="Arial" w:cs="Arial" w:eastAsia="Arial" w:hAnsi="Arial"/>
+          <w:sz w:val="21"/>
+          <w:szCs w:val="21"/>
+        </w:rPr>
+        <w:t xml:space="preserve"> e </w:t>
+      </w:r>
+      <w:r>
+        <w:rPr>
+          <w:rFonts w:ascii="Arial" w:cs="Arial" w:eastAsia="Arial" w:hAnsi="Arial"/>
+          <w:b/>
+          <w:bCs/>
+          <w:sz w:val="21"/>
+          <w:szCs w:val="21"/>
+        </w:rPr>
+        <w:t xml:space="preserve">/usuarios</w:t>
+      </w:r>
+      <w:r>
+        <w:rPr>
+          <w:rFonts w:ascii="Arial" w:cs="Arial" w:eastAsia="Arial" w:hAnsi="Arial"/>
+          <w:sz w:val="21"/>
+          <w:szCs w:val="21"/>
+        </w:rPr>
+        <w:t xml:space="preserve">, com anyRequest().authenticated(). Sem token válido: </w:t>
+      </w:r>
+      <w:r>
+        <w:rPr>
+          <w:rFonts w:ascii="Arial" w:cs="Arial" w:eastAsia="Arial" w:hAnsi="Arial"/>
+          <w:b/>
+          <w:bCs/>
+          <w:sz w:val="21"/>
+          <w:szCs w:val="21"/>
+        </w:rPr>
+        <w:t xml:space="preserve">401 Unauthorized</w:t>
+      </w:r>
+      <w:r>
+        <w:rPr>
+          <w:rFonts w:ascii="Arial" w:cs="Arial" w:eastAsia="Arial" w:hAnsi="Arial"/>
+          <w:sz w:val="21"/>
+          <w:szCs w:val="21"/>
+        </w:rPr>
+        <w:t xml:space="preserve">. Com token, mas sem o perfil necessário: </w:t>
+      </w:r>
+      <w:r>
+        <w:rPr>
+          <w:rFonts w:ascii="Arial" w:cs="Arial" w:eastAsia="Arial" w:hAnsi="Arial"/>
+          <w:b/>
+          <w:bCs/>
+          <w:sz w:val="21"/>
+          <w:szCs w:val="21"/>
+        </w:rPr>
+        <w:t xml:space="preserve">403 Forbidden</w:t>
+      </w:r>
+      <w:r>
+        <w:rPr>
+          <w:rFonts w:ascii="Arial" w:cs="Arial" w:eastAsia="Arial" w:hAnsi="Arial"/>
+          <w:sz w:val="21"/>
+          <w:szCs w:val="21"/>
+        </w:rPr>
+        <w:t xml:space="preserve">.</w:t>
+      </w:r>
+    </w:p>
+    <w:p>
+      <w:pPr>
+        <w:pStyle w:val="Heading2"/>
+      </w:pPr>
+      <w:r>
+        <w:t xml:space="preserve">2.4 Perfis de acesso</w:t>
       </w:r>
     </w:p>
     <w:p>
@@ -5756,7 +5172,7 @@
           <w:sz w:val="21"/>
           <w:szCs w:val="21"/>
         </w:rPr>
-        <w:t xml:space="preserve">Usuário (ROLE_USUARIO)</w:t>
+        <w:t xml:space="preserve">Público</w:t>
       </w:r>
       <w:r>
         <w:rPr>
@@ -5764,7 +5180,7 @@
           <w:sz w:val="21"/>
           <w:szCs w:val="21"/>
         </w:rPr>
-        <w:t xml:space="preserve">: operador ou almoxarife. Consulta pastilhas, fornecedores e estoque baixo, e registra entradas e saídas.</w:t>
+        <w:t xml:space="preserve">: quem ainda não fez login. Só pode se cadastrar e fazer login.</w:t>
       </w:r>
     </w:p>
     <w:p>
@@ -5784,7 +5200,7 @@
           <w:sz w:val="21"/>
           <w:szCs w:val="21"/>
         </w:rPr>
-        <w:t xml:space="preserve">Administrador (ROLE_ADMIN)</w:t>
+        <w:t xml:space="preserve">Usuário (USUARIO)</w:t>
       </w:r>
       <w:r>
         <w:rPr>
@@ -5792,29 +5208,7 @@
           <w:sz w:val="21"/>
           <w:szCs w:val="21"/>
         </w:rPr>
-        <w:t xml:space="preserve">: responsável pelo estoque. Pode tudo o que o Usuário pode, além de manter o cadastro de pastilhas e fornecedores, estornar movimentações e gerenciar usuários.</w:t>
-      </w:r>
-    </w:p>
-    <w:p>
-      <w:pPr>
-        <w:spacing w:after="120" w:line="276"/>
-      </w:pPr>
-      <w:r>
-        <w:rPr>
-          <w:rFonts w:ascii="Arial" w:cs="Arial" w:eastAsia="Arial" w:hAnsi="Arial"/>
-          <w:sz w:val="21"/>
-          <w:szCs w:val="21"/>
-        </w:rPr>
-        <w:t xml:space="preserve">O perfil fica em uma coluna da tabela usuario, mapeada como enum Perfil na entidade Usuario. As operações de cada perfil estão detalhadas na seção 3.</w:t>
-      </w:r>
-    </w:p>
-    <w:p>
-      <w:pPr>
-        <w:pStyle w:val="Heading2"/>
-        <w:spacing w:after="100" w:before="220"/>
-      </w:pPr>
-      <w:r>
-        <w:t xml:space="preserve">2.5 Como será feito o controle de autorização</w:t>
+        <w:t xml:space="preserve">: operador do estoque. Consulta pastilhas, fornecedores e estoque baixo, e registra entradas e saídas.</w:t>
       </w:r>
     </w:p>
     <w:p>
@@ -5834,7 +5228,7 @@
           <w:sz w:val="21"/>
           <w:szCs w:val="21"/>
         </w:rPr>
-        <w:t xml:space="preserve">Por rota</w:t>
+        <w:t xml:space="preserve">Administrador (ADMIN)</w:t>
       </w:r>
       <w:r>
         <w:rPr>
@@ -5842,7 +5236,28 @@
           <w:sz w:val="21"/>
           <w:szCs w:val="21"/>
         </w:rPr>
-        <w:t xml:space="preserve">, no SecurityFilterChain, combinando método HTTP e caminho (tabela abaixo).</w:t>
+        <w:t xml:space="preserve">: responsável pelo estoque. Faz tudo o que o Usuário faz e também cadastra, altera e exclui pastilhas e fornecedores e gerencia usuários.</w:t>
+      </w:r>
+    </w:p>
+    <w:p>
+      <w:pPr>
+        <w:spacing w:after="120" w:line="276"/>
+      </w:pPr>
+      <w:r>
+        <w:rPr>
+          <w:rFonts w:ascii="Arial" w:cs="Arial" w:eastAsia="Arial" w:hAnsi="Arial"/>
+          <w:sz w:val="21"/>
+          <w:szCs w:val="21"/>
+        </w:rPr>
+        <w:t xml:space="preserve">O perfil fica em uma coluna da tabela usuarios. Todo cadastro feito por /auth/register recebe USUARIO; o primeiro Administrador é criado por migração Flyway. As operações de cada perfil estão na seção 3.</w:t>
+      </w:r>
+    </w:p>
+    <w:p>
+      <w:pPr>
+        <w:pStyle w:val="Heading2"/>
+      </w:pPr>
+      <w:r>
+        <w:t xml:space="preserve">2.5 Como será feito o controle de autorização</w:t>
       </w:r>
     </w:p>
     <w:p>
@@ -5857,20 +5272,10 @@
       <w:r>
         <w:rPr>
           <w:rFonts w:ascii="Arial" w:cs="Arial" w:eastAsia="Arial" w:hAnsi="Arial"/>
-          <w:b/>
-          <w:bCs/>
           <w:sz w:val="21"/>
           <w:szCs w:val="21"/>
         </w:rPr>
-        <w:t xml:space="preserve">Por método</w:t>
-      </w:r>
-      <w:r>
-        <w:rPr>
-          <w:rFonts w:ascii="Arial" w:cs="Arial" w:eastAsia="Arial" w:hAnsi="Arial"/>
-          <w:sz w:val="21"/>
-          <w:szCs w:val="21"/>
-        </w:rPr>
-        <w:t xml:space="preserve">, com @PreAuthorize("hasRole('ADMIN')") nos métodos críticos do Service (estorno e gestão de usuários), como segunda barreira.</w:t>
+        <w:t xml:space="preserve">A autorização depende de uma autenticação válida: primeiro o filtro valida o token, depois verifica o perfil.</w:t>
       </w:r>
     </w:p>
     <w:p>
@@ -5888,7 +5293,7 @@
           <w:sz w:val="21"/>
           <w:szCs w:val="21"/>
         </w:rPr>
-        <w:t xml:space="preserve">O perfil vem do banco no login e é lido do token assinado; </w:t>
+        <w:t xml:space="preserve">As regras ficam no </w:t>
       </w:r>
       <w:r>
         <w:rPr>
@@ -5898,7 +5303,7 @@
           <w:sz w:val="21"/>
           <w:szCs w:val="21"/>
         </w:rPr>
-        <w:t xml:space="preserve">nunca</w:t>
+        <w:t xml:space="preserve">SecurityFilterChain</w:t>
       </w:r>
       <w:r>
         <w:rPr>
@@ -5906,7 +5311,7 @@
           <w:sz w:val="21"/>
           <w:szCs w:val="21"/>
         </w:rPr>
-        <w:t xml:space="preserve"> é aceito vindo do corpo JSON.</w:t>
+        <w:t xml:space="preserve">, combinando método HTTP e caminho com requestMatchers, conforme a tabela abaixo.</w:t>
       </w:r>
     </w:p>
     <w:p>
@@ -5924,7 +5329,43 @@
           <w:sz w:val="21"/>
           <w:szCs w:val="21"/>
         </w:rPr>
-        <w:t xml:space="preserve">O usuário que fez a movimentação é obtido do SecurityContext, e não de um campo enviado pelo cliente.</w:t>
+        <w:t xml:space="preserve">O perfil vem do banco no login e viaja dentro do token assinado. Ele </w:t>
+      </w:r>
+      <w:r>
+        <w:rPr>
+          <w:rFonts w:ascii="Arial" w:cs="Arial" w:eastAsia="Arial" w:hAnsi="Arial"/>
+          <w:b/>
+          <w:bCs/>
+          <w:sz w:val="21"/>
+          <w:szCs w:val="21"/>
+        </w:rPr>
+        <w:t xml:space="preserve">nunca</w:t>
+      </w:r>
+      <w:r>
+        <w:rPr>
+          <w:rFonts w:ascii="Arial" w:cs="Arial" w:eastAsia="Arial" w:hAnsi="Arial"/>
+          <w:sz w:val="21"/>
+          <w:szCs w:val="21"/>
+        </w:rPr>
+        <w:t xml:space="preserve"> é aceito vindo do JSON.</w:t>
+      </w:r>
+    </w:p>
+    <w:p>
+      <w:pPr>
+        <w:pStyle w:val="ListParagraph"/>
+        <w:numPr>
+          <w:ilvl w:val="0"/>
+          <w:numId w:val="2"/>
+        </w:numPr>
+        <w:spacing w:after="60" w:line="264"/>
+      </w:pPr>
+      <w:r>
+        <w:rPr>
+          <w:rFonts w:ascii="Arial" w:cs="Arial" w:eastAsia="Arial" w:hAnsi="Arial"/>
+          <w:sz w:val="21"/>
+          <w:szCs w:val="21"/>
+        </w:rPr>
+        <w:t xml:space="preserve">O usuário que registrou uma movimentação é obtido do SecurityContext (token), e não de um campo enviado pelo cliente.</w:t>
       </w:r>
     </w:p>
     <w:p>
@@ -6018,7 +5459,7 @@
                 <w:sz w:val="17"/>
                 <w:szCs w:val="17"/>
               </w:rPr>
-              <w:t xml:space="preserve">Regra no SecurityFilterChain</w:t>
+              <w:t xml:space="preserve">Quem pode acessar</w:t>
             </w:r>
           </w:p>
         </w:tc>
@@ -6054,7 +5495,7 @@
                 <w:sz w:val="17"/>
                 <w:szCs w:val="17"/>
               </w:rPr>
-              <w:t xml:space="preserve">POST /auth/login, GET /actuator/health</w:t>
+              <w:t xml:space="preserve">/auth/** (register e login)</w:t>
             </w:r>
           </w:p>
         </w:tc>
@@ -6122,49 +5563,39 @@
                 <w:sz w:val="17"/>
                 <w:szCs w:val="17"/>
               </w:rPr>
-              <w:t xml:space="preserve">GET /pastilhas/</w:t>
-            </w:r>
-            <w:r>
-              <w:rPr>
-                <w:rFonts w:ascii="Arial" w:cs="Arial" w:eastAsia="Arial" w:hAnsi="Arial"/>
-                <w:b/>
-                <w:bCs/>
+              <w:t xml:space="preserve">GET /pastilhas/**, GET /fornecedores/**, GET /movimentacoes</w:t>
+            </w:r>
+          </w:p>
+        </w:tc>
+        <w:tc>
+          <w:tcPr>
+            <w:tcW w:type="dxa" w:w="4000"/>
+            <w:tcBorders>
+              <w:top w:val="single" w:color="A6B4C4" w:sz="4"/>
+              <w:left w:val="single" w:color="A6B4C4" w:sz="4"/>
+              <w:bottom w:val="single" w:color="A6B4C4" w:sz="4"/>
+              <w:right w:val="single" w:color="A6B4C4" w:sz="4"/>
+            </w:tcBorders>
+            <w:shd w:fill="F5F7FA" w:color="auto" w:val="clear"/>
+            <w:tcMar>
+              <w:top w:type="dxa" w:w="60"/>
+              <w:left w:type="dxa" w:w="90"/>
+              <w:bottom w:type="dxa" w:w="60"/>
+              <w:right w:type="dxa" w:w="90"/>
+            </w:tcMar>
+            <w:vAlign w:val="center"/>
+          </w:tcPr>
+          <w:p>
+            <w:pPr>
+              <w:jc w:val="left"/>
+            </w:pPr>
+            <w:r>
+              <w:rPr>
+                <w:rFonts w:ascii="Arial" w:cs="Arial" w:eastAsia="Arial" w:hAnsi="Arial"/>
                 <w:sz w:val="17"/>
                 <w:szCs w:val="17"/>
               </w:rPr>
-              <w:t xml:space="preserve">, GET /fornecedores/</w:t>
-            </w:r>
-          </w:p>
-        </w:tc>
-        <w:tc>
-          <w:tcPr>
-            <w:tcW w:type="dxa" w:w="4000"/>
-            <w:tcBorders>
-              <w:top w:val="single" w:color="A6B4C4" w:sz="4"/>
-              <w:left w:val="single" w:color="A6B4C4" w:sz="4"/>
-              <w:bottom w:val="single" w:color="A6B4C4" w:sz="4"/>
-              <w:right w:val="single" w:color="A6B4C4" w:sz="4"/>
-            </w:tcBorders>
-            <w:shd w:fill="F5F7FA" w:color="auto" w:val="clear"/>
-            <w:tcMar>
-              <w:top w:type="dxa" w:w="60"/>
-              <w:left w:type="dxa" w:w="90"/>
-              <w:bottom w:type="dxa" w:w="60"/>
-              <w:right w:type="dxa" w:w="90"/>
-            </w:tcMar>
-            <w:vAlign w:val="center"/>
-          </w:tcPr>
-          <w:p>
-            <w:pPr>
-              <w:jc w:val="left"/>
-            </w:pPr>
-            <w:r>
-              <w:rPr>
-                <w:rFonts w:ascii="Arial" w:cs="Arial" w:eastAsia="Arial" w:hAnsi="Arial"/>
-                <w:sz w:val="17"/>
-                <w:szCs w:val="17"/>
-              </w:rPr>
-              <w:t xml:space="preserve">hasAnyRole("USUARIO","ADMIN")</w:t>
+              <w:t xml:space="preserve">USUARIO ou ADMIN</w:t>
             </w:r>
           </w:p>
         </w:tc>
@@ -6200,7 +5631,7 @@
                 <w:sz w:val="17"/>
                 <w:szCs w:val="17"/>
               </w:rPr>
-              <w:t xml:space="preserve">GET e POST /movimentacoes</w:t>
+              <w:t xml:space="preserve">POST /movimentacoes</w:t>
             </w:r>
           </w:p>
         </w:tc>
@@ -6231,7 +5662,7 @@
                 <w:sz w:val="17"/>
                 <w:szCs w:val="17"/>
               </w:rPr>
-              <w:t xml:space="preserve">hasAnyRole("USUARIO","ADMIN")</w:t>
+              <w:t xml:space="preserve">USUARIO ou ADMIN</w:t>
             </w:r>
           </w:p>
         </w:tc>
@@ -6268,7 +5699,7 @@
                 <w:sz w:val="17"/>
                 <w:szCs w:val="17"/>
               </w:rPr>
-              <w:t xml:space="preserve">GET e PUT /usuarios/me</w:t>
+              <w:t xml:space="preserve">POST, PUT, DELETE /pastilhas/** e /fornecedores/**</w:t>
             </w:r>
           </w:p>
         </w:tc>
@@ -6300,7 +5731,7 @@
                 <w:sz w:val="17"/>
                 <w:szCs w:val="17"/>
               </w:rPr>
-              <w:t xml:space="preserve">authenticated()</w:t>
+              <w:t xml:space="preserve">ADMIN</w:t>
             </w:r>
           </w:p>
         </w:tc>
@@ -6336,48 +5767,38 @@
                 <w:sz w:val="17"/>
                 <w:szCs w:val="17"/>
               </w:rPr>
-              <w:t xml:space="preserve">POST, PUT, DELETE /pastilhas/</w:t>
-            </w:r>
-            <w:r>
-              <w:rPr>
-                <w:rFonts w:ascii="Arial" w:cs="Arial" w:eastAsia="Arial" w:hAnsi="Arial"/>
-                <w:b/>
-                <w:bCs/>
+              <w:t xml:space="preserve">/usuarios/**</w:t>
+            </w:r>
+          </w:p>
+        </w:tc>
+        <w:tc>
+          <w:tcPr>
+            <w:tcW w:type="dxa" w:w="4000"/>
+            <w:tcBorders>
+              <w:top w:val="single" w:color="A6B4C4" w:sz="4"/>
+              <w:left w:val="single" w:color="A6B4C4" w:sz="4"/>
+              <w:bottom w:val="single" w:color="A6B4C4" w:sz="4"/>
+              <w:right w:val="single" w:color="A6B4C4" w:sz="4"/>
+            </w:tcBorders>
+            <w:tcMar>
+              <w:top w:type="dxa" w:w="60"/>
+              <w:left w:type="dxa" w:w="90"/>
+              <w:bottom w:type="dxa" w:w="60"/>
+              <w:right w:type="dxa" w:w="90"/>
+            </w:tcMar>
+            <w:vAlign w:val="center"/>
+          </w:tcPr>
+          <w:p>
+            <w:pPr>
+              <w:jc w:val="left"/>
+            </w:pPr>
+            <w:r>
+              <w:rPr>
+                <w:rFonts w:ascii="Arial" w:cs="Arial" w:eastAsia="Arial" w:hAnsi="Arial"/>
                 <w:sz w:val="17"/>
                 <w:szCs w:val="17"/>
               </w:rPr>
-              <w:t xml:space="preserve"> e /fornecedores/</w:t>
-            </w:r>
-          </w:p>
-        </w:tc>
-        <w:tc>
-          <w:tcPr>
-            <w:tcW w:type="dxa" w:w="4000"/>
-            <w:tcBorders>
-              <w:top w:val="single" w:color="A6B4C4" w:sz="4"/>
-              <w:left w:val="single" w:color="A6B4C4" w:sz="4"/>
-              <w:bottom w:val="single" w:color="A6B4C4" w:sz="4"/>
-              <w:right w:val="single" w:color="A6B4C4" w:sz="4"/>
-            </w:tcBorders>
-            <w:tcMar>
-              <w:top w:type="dxa" w:w="60"/>
-              <w:left w:type="dxa" w:w="90"/>
-              <w:bottom w:type="dxa" w:w="60"/>
-              <w:right w:type="dxa" w:w="90"/>
-            </w:tcMar>
-            <w:vAlign w:val="center"/>
-          </w:tcPr>
-          <w:p>
-            <w:pPr>
-              <w:jc w:val="left"/>
-            </w:pPr>
-            <w:r>
-              <w:rPr>
-                <w:rFonts w:ascii="Arial" w:cs="Arial" w:eastAsia="Arial" w:hAnsi="Arial"/>
-                <w:sz w:val="17"/>
-                <w:szCs w:val="17"/>
-              </w:rPr>
-              <w:t xml:space="preserve">hasRole("ADMIN")</w:t>
+              <w:t xml:space="preserve">ADMIN</w:t>
             </w:r>
           </w:p>
         </w:tc>
@@ -6414,7 +5835,7 @@
                 <w:sz w:val="17"/>
                 <w:szCs w:val="17"/>
               </w:rPr>
-              <w:t xml:space="preserve">POST /movimentacoes/{id}/estorno</w:t>
+              <w:t xml:space="preserve">Qualquer outra rota</w:t>
             </w:r>
           </w:p>
         </w:tc>
@@ -6446,143 +5867,7 @@
                 <w:sz w:val="17"/>
                 <w:szCs w:val="17"/>
               </w:rPr>
-              <w:t xml:space="preserve">hasRole("ADMIN")</w:t>
-            </w:r>
-          </w:p>
-        </w:tc>
-      </w:tr>
-      <w:tr>
-        <w:trPr>
-          <w:cantSplit/>
-        </w:trPr>
-        <w:tc>
-          <w:tcPr>
-            <w:tcW w:type="dxa" w:w="5638"/>
-            <w:tcBorders>
-              <w:top w:val="single" w:color="A6B4C4" w:sz="4"/>
-              <w:left w:val="single" w:color="A6B4C4" w:sz="4"/>
-              <w:bottom w:val="single" w:color="A6B4C4" w:sz="4"/>
-              <w:right w:val="single" w:color="A6B4C4" w:sz="4"/>
-            </w:tcBorders>
-            <w:tcMar>
-              <w:top w:type="dxa" w:w="60"/>
-              <w:left w:type="dxa" w:w="90"/>
-              <w:bottom w:type="dxa" w:w="60"/>
-              <w:right w:type="dxa" w:w="90"/>
-            </w:tcMar>
-            <w:vAlign w:val="center"/>
-          </w:tcPr>
-          <w:p>
-            <w:pPr>
-              <w:jc w:val="left"/>
-            </w:pPr>
-            <w:r>
-              <w:rPr>
-                <w:rFonts w:ascii="Arial" w:cs="Arial" w:eastAsia="Arial" w:hAnsi="Arial"/>
-                <w:sz w:val="17"/>
-                <w:szCs w:val="17"/>
-              </w:rPr>
-              <w:t xml:space="preserve">/usuarios/** (demais rotas)</w:t>
-            </w:r>
-          </w:p>
-        </w:tc>
-        <w:tc>
-          <w:tcPr>
-            <w:tcW w:type="dxa" w:w="4000"/>
-            <w:tcBorders>
-              <w:top w:val="single" w:color="A6B4C4" w:sz="4"/>
-              <w:left w:val="single" w:color="A6B4C4" w:sz="4"/>
-              <w:bottom w:val="single" w:color="A6B4C4" w:sz="4"/>
-              <w:right w:val="single" w:color="A6B4C4" w:sz="4"/>
-            </w:tcBorders>
-            <w:tcMar>
-              <w:top w:type="dxa" w:w="60"/>
-              <w:left w:type="dxa" w:w="90"/>
-              <w:bottom w:type="dxa" w:w="60"/>
-              <w:right w:type="dxa" w:w="90"/>
-            </w:tcMar>
-            <w:vAlign w:val="center"/>
-          </w:tcPr>
-          <w:p>
-            <w:pPr>
-              <w:jc w:val="left"/>
-            </w:pPr>
-            <w:r>
-              <w:rPr>
-                <w:rFonts w:ascii="Arial" w:cs="Arial" w:eastAsia="Arial" w:hAnsi="Arial"/>
-                <w:sz w:val="17"/>
-                <w:szCs w:val="17"/>
-              </w:rPr>
-              <w:t xml:space="preserve">hasRole("ADMIN")</w:t>
-            </w:r>
-          </w:p>
-        </w:tc>
-      </w:tr>
-      <w:tr>
-        <w:trPr>
-          <w:cantSplit/>
-        </w:trPr>
-        <w:tc>
-          <w:tcPr>
-            <w:tcW w:type="dxa" w:w="5638"/>
-            <w:tcBorders>
-              <w:top w:val="single" w:color="A6B4C4" w:sz="4"/>
-              <w:left w:val="single" w:color="A6B4C4" w:sz="4"/>
-              <w:bottom w:val="single" w:color="A6B4C4" w:sz="4"/>
-              <w:right w:val="single" w:color="A6B4C4" w:sz="4"/>
-            </w:tcBorders>
-            <w:shd w:fill="F5F7FA" w:color="auto" w:val="clear"/>
-            <w:tcMar>
-              <w:top w:type="dxa" w:w="60"/>
-              <w:left w:type="dxa" w:w="90"/>
-              <w:bottom w:type="dxa" w:w="60"/>
-              <w:right w:type="dxa" w:w="90"/>
-            </w:tcMar>
-            <w:vAlign w:val="center"/>
-          </w:tcPr>
-          <w:p>
-            <w:pPr>
-              <w:jc w:val="left"/>
-            </w:pPr>
-            <w:r>
-              <w:rPr>
-                <w:rFonts w:ascii="Arial" w:cs="Arial" w:eastAsia="Arial" w:hAnsi="Arial"/>
-                <w:sz w:val="17"/>
-                <w:szCs w:val="17"/>
-              </w:rPr>
-              <w:t xml:space="preserve">Qualquer outra rota</w:t>
-            </w:r>
-          </w:p>
-        </w:tc>
-        <w:tc>
-          <w:tcPr>
-            <w:tcW w:type="dxa" w:w="4000"/>
-            <w:tcBorders>
-              <w:top w:val="single" w:color="A6B4C4" w:sz="4"/>
-              <w:left w:val="single" w:color="A6B4C4" w:sz="4"/>
-              <w:bottom w:val="single" w:color="A6B4C4" w:sz="4"/>
-              <w:right w:val="single" w:color="A6B4C4" w:sz="4"/>
-            </w:tcBorders>
-            <w:shd w:fill="F5F7FA" w:color="auto" w:val="clear"/>
-            <w:tcMar>
-              <w:top w:type="dxa" w:w="60"/>
-              <w:left w:type="dxa" w:w="90"/>
-              <w:bottom w:type="dxa" w:w="60"/>
-              <w:right w:type="dxa" w:w="90"/>
-            </w:tcMar>
-            <w:vAlign w:val="center"/>
-          </w:tcPr>
-          <w:p>
-            <w:pPr>
-              <w:jc w:val="left"/>
-            </w:pPr>
-            <w:r>
-              <w:rPr>
-                <w:rFonts w:ascii="Arial" w:cs="Arial" w:eastAsia="Arial" w:hAnsi="Arial"/>
-                <w:sz w:val="17"/>
-                <w:szCs w:val="17"/>
-              </w:rPr>
-              <w:t xml:space="preserve">denyAll()</w:t>
+              <w:t xml:space="preserve">authenticated()</w:t>
             </w:r>
           </w:p>
         </w:tc>
@@ -6591,7 +5876,6 @@
     <w:p>
       <w:pPr>
         <w:pStyle w:val="Heading2"/>
-        <w:spacing w:after="100" w:before="220"/>
       </w:pPr>
       <w:r>
         <w:t xml:space="preserve">2.6 Armazenamento e proteção das credenciais</w:t>
@@ -6612,7 +5896,7 @@
           <w:sz w:val="21"/>
           <w:szCs w:val="21"/>
         </w:rPr>
-        <w:t xml:space="preserve">Senhas armazenadas com </w:t>
+        <w:t xml:space="preserve">Senhas salvas com </w:t>
       </w:r>
       <w:r>
         <w:rPr>
@@ -6630,7 +5914,7 @@
           <w:sz w:val="21"/>
           <w:szCs w:val="21"/>
         </w:rPr>
-        <w:t xml:space="preserve">, um bean injetado pelo Spring no Service. Nunca são salvas em texto puro.</w:t>
+        <w:t xml:space="preserve"> (declarado como @Bean PasswordEncoder). O banco guarda só o hash, nunca a senha original.</w:t>
       </w:r>
     </w:p>
     <w:p>
@@ -6648,25 +5932,7 @@
           <w:sz w:val="21"/>
           <w:szCs w:val="21"/>
         </w:rPr>
-        <w:t xml:space="preserve">A entidade Usuario não é devolvida diretamente: a resposta usa um record UsuarioResponse </w:t>
-      </w:r>
-      <w:r>
-        <w:rPr>
-          <w:rFonts w:ascii="Arial" w:cs="Arial" w:eastAsia="Arial" w:hAnsi="Arial"/>
-          <w:b/>
-          <w:bCs/>
-          <w:sz w:val="21"/>
-          <w:szCs w:val="21"/>
-        </w:rPr>
-        <w:t xml:space="preserve">sem o campo senha</w:t>
-      </w:r>
-      <w:r>
-        <w:rPr>
-          <w:rFonts w:ascii="Arial" w:cs="Arial" w:eastAsia="Arial" w:hAnsi="Arial"/>
-          <w:sz w:val="21"/>
-          <w:szCs w:val="21"/>
-        </w:rPr>
-        <w:t xml:space="preserve">. A senha também não aparece em logs.</w:t>
+        <w:t xml:space="preserve">Tabela usuarios criada por migração Flyway: id BIGSERIAL, nome, email VARCHAR(255) NOT NULL UNIQUE, senha VARCHAR(255) NOT NULL, ativo BOOLEAN NOT NULL DEFAULT TRUE e perfil.</w:t>
       </w:r>
     </w:p>
     <w:p>
@@ -6684,7 +5950,7 @@
           <w:sz w:val="21"/>
           <w:szCs w:val="21"/>
         </w:rPr>
-        <w:t xml:space="preserve">Senha mínima de 8 caracteres, com letras e números, validada com @Size e @Pattern no record de request.</w:t>
+        <w:t xml:space="preserve">Os DTOs de resposta não têm o campo senha.</w:t>
       </w:r>
     </w:p>
     <w:p>
@@ -6699,38 +5965,10 @@
       <w:r>
         <w:rPr>
           <w:rFonts w:ascii="Arial" w:cs="Arial" w:eastAsia="Arial" w:hAnsi="Arial"/>
-          <w:b/>
-          <w:bCs/>
           <w:sz w:val="21"/>
           <w:szCs w:val="21"/>
         </w:rPr>
-        <w:t xml:space="preserve">spring.datasource.password</w:t>
-      </w:r>
-      <w:r>
-        <w:rPr>
-          <w:rFonts w:ascii="Arial" w:cs="Arial" w:eastAsia="Arial" w:hAnsi="Arial"/>
-          <w:sz w:val="21"/>
-          <w:szCs w:val="21"/>
-        </w:rPr>
-        <w:t xml:space="preserve"> e a chave secreta do token ficam em </w:t>
-      </w:r>
-      <w:r>
-        <w:rPr>
-          <w:rFonts w:ascii="Arial" w:cs="Arial" w:eastAsia="Arial" w:hAnsi="Arial"/>
-          <w:b/>
-          <w:bCs/>
-          <w:sz w:val="21"/>
-          <w:szCs w:val="21"/>
-        </w:rPr>
-        <w:t xml:space="preserve">variáveis de ambiente</w:t>
-      </w:r>
-      <w:r>
-        <w:rPr>
-          <w:rFonts w:ascii="Arial" w:cs="Arial" w:eastAsia="Arial" w:hAnsi="Arial"/>
-          <w:sz w:val="21"/>
-          <w:szCs w:val="21"/>
-        </w:rPr>
-        <w:t xml:space="preserve">, nunca escritas no application.properties versionado.</w:t>
+        <w:t xml:space="preserve">Senha do banco e chave de assinatura do token ficam em variáveis de ambiente, fora do application.properties versionado no GitHub.</w:t>
       </w:r>
     </w:p>
     <w:p>
@@ -6748,13 +5986,12 @@
           <w:sz w:val="21"/>
           <w:szCs w:val="21"/>
         </w:rPr>
-        <w:t xml:space="preserve">O banco usa um usuário próprio (ex.: estoque_user) em vez do superusuário postgres.</w:t>
+        <w:t xml:space="preserve">A aplicação usa um usuário próprio no PostgreSQL.</w:t>
       </w:r>
     </w:p>
     <w:p>
       <w:pPr>
         <w:pStyle w:val="Heading2"/>
-        <w:spacing w:after="100" w:before="220"/>
       </w:pPr>
       <w:r>
         <w:t xml:space="preserve">2.7 Configuração do CORS</w:t>
@@ -6772,10 +6009,20 @@
       <w:r>
         <w:rPr>
           <w:rFonts w:ascii="Arial" w:cs="Arial" w:eastAsia="Arial" w:hAnsi="Arial"/>
+          <w:b/>
+          <w:bCs/>
           <w:sz w:val="21"/>
           <w:szCs w:val="21"/>
         </w:rPr>
-        <w:t xml:space="preserve">Configurado no Spring Security com CorsConfigurationSource.</w:t>
+        <w:t xml:space="preserve">Origem permitida</w:t>
+      </w:r>
+      <w:r>
+        <w:rPr>
+          <w:rFonts w:ascii="Arial" w:cs="Arial" w:eastAsia="Arial" w:hAnsi="Arial"/>
+          <w:sz w:val="21"/>
+          <w:szCs w:val="21"/>
+        </w:rPr>
+        <w:t xml:space="preserve">: somente a do front-end do projeto (ex.: http://localhost:5173 no desenvolvimento). Nada de liberar todas as origens ("*").</w:t>
       </w:r>
     </w:p>
     <w:p>
@@ -6795,7 +6042,7 @@
           <w:sz w:val="21"/>
           <w:szCs w:val="21"/>
         </w:rPr>
-        <w:t xml:space="preserve">Origem permitida</w:t>
+        <w:t xml:space="preserve">Métodos</w:t>
       </w:r>
       <w:r>
         <w:rPr>
@@ -6803,7 +6050,7 @@
           <w:sz w:val="21"/>
           <w:szCs w:val="21"/>
         </w:rPr>
-        <w:t xml:space="preserve">: apenas a do front-end do projeto (ex.: http://localhost:5173 no desenvolvimento). Nenhum "*".</w:t>
+        <w:t xml:space="preserve">: GET, POST, PUT, DELETE e OPTIONS.</w:t>
       </w:r>
     </w:p>
     <w:p>
@@ -6823,7 +6070,7 @@
           <w:sz w:val="21"/>
           <w:szCs w:val="21"/>
         </w:rPr>
-        <w:t xml:space="preserve">Métodos</w:t>
+        <w:t xml:space="preserve">Headers</w:t>
       </w:r>
       <w:r>
         <w:rPr>
@@ -6831,7 +6078,15 @@
           <w:sz w:val="21"/>
           <w:szCs w:val="21"/>
         </w:rPr>
-        <w:t xml:space="preserve">: GET, POST, PUT, DELETE e OPTIONS (preflight).</w:t>
+        <w:t xml:space="preserve">: Authorization e Content-Type.</w:t>
+      </w:r>
+    </w:p>
+    <w:p>
+      <w:pPr>
+        <w:pStyle w:val="Heading2"/>
+      </w:pPr>
+      <w:r>
+        <w:t xml:space="preserve">2.8 Outros mecanismos contra as vulnerabilidades</w:t>
       </w:r>
     </w:p>
     <w:p>
@@ -6851,7 +6106,7 @@
           <w:sz w:val="21"/>
           <w:szCs w:val="21"/>
         </w:rPr>
-        <w:t xml:space="preserve">Headers</w:t>
+        <w:t xml:space="preserve">CSRF</w:t>
       </w:r>
       <w:r>
         <w:rPr>
@@ -6859,7 +6114,7 @@
           <w:sz w:val="21"/>
           <w:szCs w:val="21"/>
         </w:rPr>
-        <w:t xml:space="preserve">: Authorization e Content-Type.</w:t>
+        <w:t xml:space="preserve">: csrf.disable(), porque a API é stateless e o token vai no header, não em cookie (como na Aula 10).</w:t>
       </w:r>
     </w:p>
     <w:p>
@@ -6874,19 +6129,20 @@
       <w:r>
         <w:rPr>
           <w:rFonts w:ascii="Arial" w:cs="Arial" w:eastAsia="Arial" w:hAnsi="Arial"/>
+          <w:b/>
+          <w:bCs/>
           <w:sz w:val="21"/>
           <w:szCs w:val="21"/>
         </w:rPr>
-        <w:t xml:space="preserve">allowCredentials = false, pois o token vai no header e não em cookie.</w:t>
-      </w:r>
-    </w:p>
-    <w:p>
-      <w:pPr>
-        <w:pStyle w:val="Heading2"/>
-        <w:spacing w:after="100" w:before="220"/>
-      </w:pPr>
-      <w:r>
-        <w:t xml:space="preserve">2.8 Outros mecanismos contra as vulnerabilidades identificadas</w:t>
+        <w:t xml:space="preserve">SQL Injection</w:t>
+      </w:r>
+      <w:r>
+        <w:rPr>
+          <w:rFonts w:ascii="Arial" w:cs="Arial" w:eastAsia="Arial" w:hAnsi="Arial"/>
+          <w:sz w:val="21"/>
+          <w:szCs w:val="21"/>
+        </w:rPr>
+        <w:t xml:space="preserve">: acesso ao banco só pelo JpaRepository, consultas derivadas ou @Query com @Param.</w:t>
       </w:r>
     </w:p>
     <w:p>
@@ -6906,7 +6162,7 @@
           <w:sz w:val="21"/>
           <w:szCs w:val="21"/>
         </w:rPr>
-        <w:t xml:space="preserve">CSRF</w:t>
+        <w:t xml:space="preserve">XSS</w:t>
       </w:r>
       <w:r>
         <w:rPr>
@@ -6914,7 +6170,7 @@
           <w:sz w:val="21"/>
           <w:szCs w:val="21"/>
         </w:rPr>
-        <w:t xml:space="preserve">: desabilitado de forma justificada, porque a API não usa sessão nem cookie. Se o token passar a ser guardado em cookie, a proteção será reativada.</w:t>
+        <w:t xml:space="preserve">: Bean Validation nos DTOs e respostas sempre em JSON.</w:t>
       </w:r>
     </w:p>
     <w:p>
@@ -6934,7 +6190,7 @@
           <w:sz w:val="21"/>
           <w:szCs w:val="21"/>
         </w:rPr>
-        <w:t xml:space="preserve">SQL Injection</w:t>
+        <w:t xml:space="preserve">Clickjacking</w:t>
       </w:r>
       <w:r>
         <w:rPr>
@@ -6942,7 +6198,7 @@
           <w:sz w:val="21"/>
           <w:szCs w:val="21"/>
         </w:rPr>
-        <w:t xml:space="preserve">: acesso a dados somente pelo JpaRepository, por consultas derivadas ou por @Query com @Param. Nunca concatenar Strings em SQL, nem em nativeQuery.</w:t>
+        <w:t xml:space="preserve">: manter os cabeçalhos padrão do Spring Security.</w:t>
       </w:r>
     </w:p>
     <w:p>
@@ -6962,7 +6218,7 @@
           <w:sz w:val="21"/>
           <w:szCs w:val="21"/>
         </w:rPr>
-        <w:t xml:space="preserve">XSS</w:t>
+        <w:t xml:space="preserve">HTTPS</w:t>
       </w:r>
       <w:r>
         <w:rPr>
@@ -6970,7 +6226,7 @@
           <w:sz w:val="21"/>
           <w:szCs w:val="21"/>
         </w:rPr>
-        <w:t xml:space="preserve">: validação dos campos de texto (@NotBlank, @Size, @Pattern), respostas sempre em application/json e exibição como texto no front-end.</w:t>
+        <w:t xml:space="preserve"> em produção, para proteger senha e token no transporte.</w:t>
       </w:r>
     </w:p>
     <w:p>
@@ -6998,7 +6254,7 @@
           <w:sz w:val="21"/>
           <w:szCs w:val="21"/>
         </w:rPr>
-        <w:t xml:space="preserve">: @Positive na quantidade; o Service impede saldo negativo; @Transactional garante rollback em caso de falha.</w:t>
+        <w:t xml:space="preserve">: @Positive na quantidade, Service confere o saldo, @Transactional com rollback.</w:t>
       </w:r>
     </w:p>
     <w:p>
@@ -7018,7 +6274,7 @@
           <w:sz w:val="21"/>
           <w:szCs w:val="21"/>
         </w:rPr>
-        <w:t xml:space="preserve">Records de request/response</w:t>
+        <w:t xml:space="preserve">Paginação</w:t>
       </w:r>
       <w:r>
         <w:rPr>
@@ -7026,157 +6282,21 @@
           <w:sz w:val="21"/>
           <w:szCs w:val="21"/>
         </w:rPr>
-        <w:t xml:space="preserve"> separados das entidades, para o cliente não conseguir alterar campos como id, perfil, usuário ou data.</w:t>
-      </w:r>
-    </w:p>
-    <w:p>
-      <w:pPr>
-        <w:pStyle w:val="ListParagraph"/>
-        <w:numPr>
-          <w:ilvl w:val="0"/>
-          <w:numId w:val="2"/>
-        </w:numPr>
-        <w:spacing w:after="60" w:line="264"/>
-      </w:pPr>
-      <w:r>
-        <w:rPr>
-          <w:rFonts w:ascii="Arial" w:cs="Arial" w:eastAsia="Arial" w:hAnsi="Arial"/>
-          <w:b/>
-          <w:bCs/>
-          <w:sz w:val="21"/>
-          <w:szCs w:val="21"/>
-        </w:rPr>
-        <w:t xml:space="preserve">Erros padronizados</w:t>
-      </w:r>
-      <w:r>
-        <w:rPr>
-          <w:rFonts w:ascii="Arial" w:cs="Arial" w:eastAsia="Arial" w:hAnsi="Arial"/>
-          <w:sz w:val="21"/>
-          <w:szCs w:val="21"/>
-        </w:rPr>
-        <w:t xml:space="preserve"> com @RestControllerAdvice, sem stack trace na resposta.</w:t>
-      </w:r>
-    </w:p>
-    <w:p>
-      <w:pPr>
-        <w:pStyle w:val="ListParagraph"/>
-        <w:numPr>
-          <w:ilvl w:val="0"/>
-          <w:numId w:val="2"/>
-        </w:numPr>
-        <w:spacing w:after="60" w:line="264"/>
-      </w:pPr>
-      <w:r>
-        <w:rPr>
-          <w:rFonts w:ascii="Arial" w:cs="Arial" w:eastAsia="Arial" w:hAnsi="Arial"/>
-          <w:b/>
-          <w:bCs/>
-          <w:sz w:val="21"/>
-          <w:szCs w:val="21"/>
-        </w:rPr>
-        <w:t xml:space="preserve">Paginação</w:t>
-      </w:r>
-      <w:r>
-        <w:rPr>
-          <w:rFonts w:ascii="Arial" w:cs="Arial" w:eastAsia="Arial" w:hAnsi="Arial"/>
-          <w:sz w:val="21"/>
-          <w:szCs w:val="21"/>
-        </w:rPr>
-        <w:t xml:space="preserve"> com Pageable e limite de 50 itens por página.</w:t>
-      </w:r>
-    </w:p>
-    <w:p>
-      <w:pPr>
-        <w:pStyle w:val="ListParagraph"/>
-        <w:numPr>
-          <w:ilvl w:val="0"/>
-          <w:numId w:val="2"/>
-        </w:numPr>
-        <w:spacing w:after="60" w:line="264"/>
-      </w:pPr>
-      <w:r>
-        <w:rPr>
-          <w:rFonts w:ascii="Arial" w:cs="Arial" w:eastAsia="Arial" w:hAnsi="Arial"/>
-          <w:b/>
-          <w:bCs/>
-          <w:sz w:val="21"/>
-          <w:szCs w:val="21"/>
-        </w:rPr>
-        <w:t xml:space="preserve">Flyway</w:t>
-      </w:r>
-      <w:r>
-        <w:rPr>
-          <w:rFonts w:ascii="Arial" w:cs="Arial" w:eastAsia="Arial" w:hAnsi="Arial"/>
-          <w:sz w:val="21"/>
-          <w:szCs w:val="21"/>
-        </w:rPr>
-        <w:t xml:space="preserve">: esquema e usuário admin inicial criados por migrações versionadas, com ddl-auto=validate e show-sql=false em produção.</w:t>
-      </w:r>
-    </w:p>
-    <w:p>
-      <w:pPr>
-        <w:pStyle w:val="ListParagraph"/>
-        <w:numPr>
-          <w:ilvl w:val="0"/>
-          <w:numId w:val="2"/>
-        </w:numPr>
-        <w:spacing w:after="60" w:line="264"/>
-      </w:pPr>
-      <w:r>
-        <w:rPr>
-          <w:rFonts w:ascii="Arial" w:cs="Arial" w:eastAsia="Arial" w:hAnsi="Arial"/>
-          <w:b/>
-          <w:bCs/>
-          <w:sz w:val="21"/>
-          <w:szCs w:val="21"/>
-        </w:rPr>
-        <w:t xml:space="preserve">Actuator</w:t>
-      </w:r>
-      <w:r>
-        <w:rPr>
-          <w:rFonts w:ascii="Arial" w:cs="Arial" w:eastAsia="Arial" w:hAnsi="Arial"/>
-          <w:sz w:val="21"/>
-          <w:szCs w:val="21"/>
-        </w:rPr>
-        <w:t xml:space="preserve">: apenas o endpoint health exposto.</w:t>
-      </w:r>
-    </w:p>
-    <w:p>
-      <w:pPr>
-        <w:pStyle w:val="ListParagraph"/>
-        <w:numPr>
-          <w:ilvl w:val="0"/>
-          <w:numId w:val="2"/>
-        </w:numPr>
-        <w:spacing w:after="60" w:line="264"/>
-      </w:pPr>
-      <w:r>
-        <w:rPr>
-          <w:rFonts w:ascii="Arial" w:cs="Arial" w:eastAsia="Arial" w:hAnsi="Arial"/>
-          <w:b/>
-          <w:bCs/>
-          <w:sz w:val="21"/>
-          <w:szCs w:val="21"/>
-        </w:rPr>
-        <w:t xml:space="preserve">HTTPS</w:t>
-      </w:r>
-      <w:r>
-        <w:rPr>
-          <w:rFonts w:ascii="Arial" w:cs="Arial" w:eastAsia="Arial" w:hAnsi="Arial"/>
-          <w:sz w:val="21"/>
-          <w:szCs w:val="21"/>
-        </w:rPr>
-        <w:t xml:space="preserve"> em produção, para que senha e token não trafeguem em texto aberto.</w:t>
+        <w:t xml:space="preserve"> com Pageable nas listagens.</w:t>
       </w:r>
     </w:p>
     <w:p>
       <w:pPr>
         <w:pStyle w:val="Heading2"/>
-        <w:spacing w:after="100" w:before="220"/>
       </w:pPr>
       <w:r>
         <w:t xml:space="preserve">2.9 Onde cada controle fica na arquitetura</w:t>
       </w:r>
+    </w:p>
+    <w:p>
+      <w:pPr>
+        <w:spacing w:after="80"/>
+      </w:pPr>
     </w:p>
     <w:tbl>
       <w:tblPr>
@@ -7300,7 +6420,7 @@
                 <w:sz w:val="17"/>
                 <w:szCs w:val="17"/>
               </w:rPr>
-              <w:t xml:space="preserve">Filtro do Spring Security (antes do Controller)</w:t>
+              <w:t xml:space="preserve">Cadeia de filtros (SecurityFilterChain)</w:t>
             </w:r>
           </w:p>
         </w:tc>
@@ -7331,7 +6451,7 @@
                 <w:sz w:val="17"/>
                 <w:szCs w:val="17"/>
               </w:rPr>
-              <w:t xml:space="preserve">Lê o header Authorization, valida o token, aplica as regras por rota, CORS e responde 401/403.</w:t>
+              <w:t xml:space="preserve">Antes do Controller: lê o Bearer token, valida o JWT, aplica as regras de rota e perfil. Falhas param o fluxo com 401 ou 403.</w:t>
             </w:r>
           </w:p>
         </w:tc>
@@ -7400,7 +6520,7 @@
                 <w:sz w:val="17"/>
                 <w:szCs w:val="17"/>
               </w:rPr>
-              <w:t xml:space="preserve">Recebe records de request com @Valid (retorna 400 se inválido); devolve DTOs de resposta, nunca a entidade; usa o status code correto (201, 204, 404).</w:t>
+              <w:t xml:space="preserve">Recebe DTOs com @Valid (400 se inválido), devolve DTOs de resposta (nunca a entidade Usuario com senha) e o status code correto.</w:t>
             </w:r>
           </w:p>
         </w:tc>
@@ -7467,7 +6587,7 @@
                 <w:sz w:val="17"/>
                 <w:szCs w:val="17"/>
               </w:rPr>
-              <w:t xml:space="preserve">Regras de negócio (saldo, estorno), @Transactional, @PreAuthorize nas operações críticas e o usuário logado obtido do SecurityContext.</w:t>
+              <w:t xml:space="preserve">Regras de negócio (saldo, perfil USUARIO no cadastro), hash da senha com PasswordEncoder, @Transactional.</w:t>
             </w:r>
           </w:p>
         </w:tc>
@@ -7536,7 +6656,7 @@
                 <w:sz w:val="17"/>
                 <w:szCs w:val="17"/>
               </w:rPr>
-              <w:t xml:space="preserve">Acesso ao banco só por métodos do Spring Data, consultas derivadas ou @Query com @Param; nada de SQL concatenado.</w:t>
+              <w:t xml:space="preserve">Consultas pelo Spring Data: métodos prontos, consultas derivadas ou @Query com @Param. Nada de SQL concatenado.</w:t>
             </w:r>
           </w:p>
         </w:tc>
@@ -7603,7 +6723,7 @@
                 <w:sz w:val="17"/>
                 <w:szCs w:val="17"/>
               </w:rPr>
-              <w:t xml:space="preserve">Usuario com senha em hash e perfil (enum ADMIN/USUARIO); Movimentacao com usuário e data obrigatórios (@Column(nullable = false)).</w:t>
+              <w:t xml:space="preserve">Usuario (nome, email único, senha em hash, ativo, perfil) e Movimentacao com usuário e data obrigatórios.</w:t>
             </w:r>
           </w:p>
         </w:tc>
@@ -7672,12 +6792,155 @@
                 <w:sz w:val="17"/>
                 <w:szCs w:val="17"/>
               </w:rPr>
-              <w:t xml:space="preserve">PostgreSQL com usuário próprio; Flyway versionando o esquema; segredos em variáveis de ambiente; Actuator restrito.</w:t>
+              <w:t xml:space="preserve">PostgreSQL com usuário próprio, Flyway versionando o esquema, segredos em variáveis de ambiente.</w:t>
             </w:r>
           </w:p>
         </w:tc>
       </w:tr>
     </w:tbl>
+    <w:p>
+      <w:pPr>
+        <w:pStyle w:val="Heading2"/>
+      </w:pPr>
+      <w:r>
+        <w:t xml:space="preserve">2.10 Configuração prevista (base da Aula 10)</w:t>
+      </w:r>
+    </w:p>
+    <w:p>
+      <w:pPr>
+        <w:shd w:fill="F2F4F7" w:color="auto" w:val="clear"/>
+        <w:spacing w:after="0"/>
+        <w:ind w:left="200"/>
+      </w:pPr>
+      <w:r>
+        <w:rPr>
+          <w:rFonts w:ascii="Consolas" w:cs="Consolas" w:eastAsia="Consolas" w:hAnsi="Consolas"/>
+          <w:sz w:val="18"/>
+          <w:szCs w:val="18"/>
+        </w:rPr>
+        <w:t xml:space="preserve">http</w:t>
+      </w:r>
+    </w:p>
+    <w:p>
+      <w:pPr>
+        <w:shd w:fill="F2F4F7" w:color="auto" w:val="clear"/>
+        <w:spacing w:after="0"/>
+        <w:ind w:left="200"/>
+      </w:pPr>
+      <w:r>
+        <w:rPr>
+          <w:rFonts w:ascii="Consolas" w:cs="Consolas" w:eastAsia="Consolas" w:hAnsi="Consolas"/>
+          <w:sz w:val="18"/>
+          <w:szCs w:val="18"/>
+        </w:rPr>
+        <w:t xml:space="preserve">  .csrf(csrf -&gt; csrf.disable())</w:t>
+      </w:r>
+    </w:p>
+    <w:p>
+      <w:pPr>
+        <w:shd w:fill="F2F4F7" w:color="auto" w:val="clear"/>
+        <w:spacing w:after="0"/>
+        <w:ind w:left="200"/>
+      </w:pPr>
+      <w:r>
+        <w:rPr>
+          <w:rFonts w:ascii="Consolas" w:cs="Consolas" w:eastAsia="Consolas" w:hAnsi="Consolas"/>
+          <w:sz w:val="18"/>
+          <w:szCs w:val="18"/>
+        </w:rPr>
+        <w:t xml:space="preserve">  .sessionManagement(session -&gt; session</w:t>
+      </w:r>
+    </w:p>
+    <w:p>
+      <w:pPr>
+        <w:shd w:fill="F2F4F7" w:color="auto" w:val="clear"/>
+        <w:spacing w:after="0"/>
+        <w:ind w:left="200"/>
+      </w:pPr>
+      <w:r>
+        <w:rPr>
+          <w:rFonts w:ascii="Consolas" w:cs="Consolas" w:eastAsia="Consolas" w:hAnsi="Consolas"/>
+          <w:sz w:val="18"/>
+          <w:szCs w:val="18"/>
+        </w:rPr>
+        <w:t xml:space="preserve">      .sessionCreationPolicy(SessionCreationPolicy.STATELESS))</w:t>
+      </w:r>
+    </w:p>
+    <w:p>
+      <w:pPr>
+        <w:shd w:fill="F2F4F7" w:color="auto" w:val="clear"/>
+        <w:spacing w:after="0"/>
+        <w:ind w:left="200"/>
+      </w:pPr>
+      <w:r>
+        <w:rPr>
+          <w:rFonts w:ascii="Consolas" w:cs="Consolas" w:eastAsia="Consolas" w:hAnsi="Consolas"/>
+          <w:sz w:val="18"/>
+          <w:szCs w:val="18"/>
+        </w:rPr>
+        <w:t xml:space="preserve">  .authorizeHttpRequests(auth -&gt; auth</w:t>
+      </w:r>
+    </w:p>
+    <w:p>
+      <w:pPr>
+        <w:shd w:fill="F2F4F7" w:color="auto" w:val="clear"/>
+        <w:spacing w:after="0"/>
+        <w:ind w:left="200"/>
+      </w:pPr>
+      <w:r>
+        <w:rPr>
+          <w:rFonts w:ascii="Consolas" w:cs="Consolas" w:eastAsia="Consolas" w:hAnsi="Consolas"/>
+          <w:sz w:val="18"/>
+          <w:szCs w:val="18"/>
+        </w:rPr>
+        <w:t xml:space="preserve">      .requestMatchers("/auth/§§").permitAll()</w:t>
+      </w:r>
+    </w:p>
+    <w:p>
+      <w:pPr>
+        <w:shd w:fill="F2F4F7" w:color="auto" w:val="clear"/>
+        <w:spacing w:after="0"/>
+        <w:ind w:left="200"/>
+      </w:pPr>
+      <w:r>
+        <w:rPr>
+          <w:rFonts w:ascii="Consolas" w:cs="Consolas" w:eastAsia="Consolas" w:hAnsi="Consolas"/>
+          <w:sz w:val="18"/>
+          <w:szCs w:val="18"/>
+        </w:rPr>
+        <w:t xml:space="preserve">      // regras por perfil da tabela 2.5</w:t>
+      </w:r>
+    </w:p>
+    <w:p>
+      <w:pPr>
+        <w:shd w:fill="F2F4F7" w:color="auto" w:val="clear"/>
+        <w:spacing w:after="0"/>
+        <w:ind w:left="200"/>
+      </w:pPr>
+      <w:r>
+        <w:rPr>
+          <w:rFonts w:ascii="Consolas" w:cs="Consolas" w:eastAsia="Consolas" w:hAnsi="Consolas"/>
+          <w:sz w:val="18"/>
+          <w:szCs w:val="18"/>
+        </w:rPr>
+        <w:t xml:space="preserve">      .anyRequest().authenticated())</w:t>
+      </w:r>
+    </w:p>
+    <w:p>
+      <w:pPr>
+        <w:shd w:fill="F2F4F7" w:color="auto" w:val="clear"/>
+        <w:spacing w:after="160"/>
+        <w:ind w:left="200"/>
+      </w:pPr>
+      <w:r>
+        <w:rPr>
+          <w:rFonts w:ascii="Consolas" w:cs="Consolas" w:eastAsia="Consolas" w:hAnsi="Consolas"/>
+          <w:sz w:val="18"/>
+          <w:szCs w:val="18"/>
+        </w:rPr>
+        <w:t xml:space="preserve">  .oauth2ResourceServer(oauth2 -&gt; oauth2.jwt());</w:t>
+      </w:r>
+    </w:p>
     <w:p>
       <w:pPr>
         <w:pStyle w:val="Heading1"/>
@@ -7881,7 +7144,7 @@
                 <w:sz w:val="18"/>
                 <w:szCs w:val="18"/>
               </w:rPr>
-              <w:t xml:space="preserve">Realizar login (POST /auth/login)</w:t>
+              <w:t xml:space="preserve">Cadastrar-se (POST /auth/register)</w:t>
             </w:r>
           </w:p>
         </w:tc>
@@ -7943,7 +7206,7 @@
                 <w:sz w:val="18"/>
                 <w:szCs w:val="18"/>
               </w:rPr>
-              <w:t xml:space="preserve">Sim</w:t>
+              <w:t xml:space="preserve">—</w:t>
             </w:r>
           </w:p>
         </w:tc>
@@ -7974,7 +7237,7 @@
                 <w:sz w:val="18"/>
                 <w:szCs w:val="18"/>
               </w:rPr>
-              <w:t xml:space="preserve">Sim</w:t>
+              <w:t xml:space="preserve">—</w:t>
             </w:r>
           </w:p>
         </w:tc>
@@ -8011,7 +7274,7 @@
                 <w:sz w:val="18"/>
                 <w:szCs w:val="18"/>
               </w:rPr>
-              <w:t xml:space="preserve">Verificar status (GET /actuator/health)</w:t>
+              <w:t xml:space="preserve">Realizar login (POST /auth/login)</w:t>
             </w:r>
           </w:p>
         </w:tc>
@@ -8143,7 +7406,7 @@
                 <w:sz w:val="18"/>
                 <w:szCs w:val="18"/>
               </w:rPr>
-              <w:t xml:space="preserve">Listar, consultar e pesquisar pastilhas</w:t>
+              <w:t xml:space="preserve">Consultar e pesquisar pastilhas</w:t>
             </w:r>
           </w:p>
         </w:tc>
@@ -9321,268 +8584,6 @@
                 <w:sz w:val="18"/>
                 <w:szCs w:val="18"/>
               </w:rPr>
-              <w:t xml:space="preserve">Estornar movimentação</w:t>
-            </w:r>
-          </w:p>
-        </w:tc>
-        <w:tc>
-          <w:tcPr>
-            <w:tcW w:type="dxa" w:w="1400"/>
-            <w:tcBorders>
-              <w:top w:val="single" w:color="A6B4C4" w:sz="4"/>
-              <w:left w:val="single" w:color="A6B4C4" w:sz="4"/>
-              <w:bottom w:val="single" w:color="A6B4C4" w:sz="4"/>
-              <w:right w:val="single" w:color="A6B4C4" w:sz="4"/>
-            </w:tcBorders>
-            <w:shd w:fill="F5F7FA" w:color="auto" w:val="clear"/>
-            <w:tcMar>
-              <w:top w:type="dxa" w:w="60"/>
-              <w:left w:type="dxa" w:w="90"/>
-              <w:bottom w:type="dxa" w:w="60"/>
-              <w:right w:type="dxa" w:w="90"/>
-            </w:tcMar>
-            <w:vAlign w:val="center"/>
-          </w:tcPr>
-          <w:p>
-            <w:pPr>
-              <w:jc w:val="center"/>
-            </w:pPr>
-            <w:r>
-              <w:rPr>
-                <w:rFonts w:ascii="Arial" w:cs="Arial" w:eastAsia="Arial" w:hAnsi="Arial"/>
-                <w:sz w:val="18"/>
-                <w:szCs w:val="18"/>
-              </w:rPr>
-              <w:t xml:space="preserve">Não</w:t>
-            </w:r>
-          </w:p>
-        </w:tc>
-        <w:tc>
-          <w:tcPr>
-            <w:tcW w:type="dxa" w:w="1450"/>
-            <w:tcBorders>
-              <w:top w:val="single" w:color="A6B4C4" w:sz="4"/>
-              <w:left w:val="single" w:color="A6B4C4" w:sz="4"/>
-              <w:bottom w:val="single" w:color="A6B4C4" w:sz="4"/>
-              <w:right w:val="single" w:color="A6B4C4" w:sz="4"/>
-            </w:tcBorders>
-            <w:shd w:fill="F5F7FA" w:color="auto" w:val="clear"/>
-            <w:tcMar>
-              <w:top w:type="dxa" w:w="60"/>
-              <w:left w:type="dxa" w:w="90"/>
-              <w:bottom w:type="dxa" w:w="60"/>
-              <w:right w:type="dxa" w:w="90"/>
-            </w:tcMar>
-            <w:vAlign w:val="center"/>
-          </w:tcPr>
-          <w:p>
-            <w:pPr>
-              <w:jc w:val="center"/>
-            </w:pPr>
-            <w:r>
-              <w:rPr>
-                <w:rFonts w:ascii="Arial" w:cs="Arial" w:eastAsia="Arial" w:hAnsi="Arial"/>
-                <w:sz w:val="18"/>
-                <w:szCs w:val="18"/>
-              </w:rPr>
-              <w:t xml:space="preserve">Não</w:t>
-            </w:r>
-          </w:p>
-        </w:tc>
-        <w:tc>
-          <w:tcPr>
-            <w:tcW w:type="dxa" w:w="1450"/>
-            <w:tcBorders>
-              <w:top w:val="single" w:color="A6B4C4" w:sz="4"/>
-              <w:left w:val="single" w:color="A6B4C4" w:sz="4"/>
-              <w:bottom w:val="single" w:color="A6B4C4" w:sz="4"/>
-              <w:right w:val="single" w:color="A6B4C4" w:sz="4"/>
-            </w:tcBorders>
-            <w:shd w:fill="F5F7FA" w:color="auto" w:val="clear"/>
-            <w:tcMar>
-              <w:top w:type="dxa" w:w="60"/>
-              <w:left w:type="dxa" w:w="90"/>
-              <w:bottom w:type="dxa" w:w="60"/>
-              <w:right w:type="dxa" w:w="90"/>
-            </w:tcMar>
-            <w:vAlign w:val="center"/>
-          </w:tcPr>
-          <w:p>
-            <w:pPr>
-              <w:jc w:val="center"/>
-            </w:pPr>
-            <w:r>
-              <w:rPr>
-                <w:rFonts w:ascii="Arial" w:cs="Arial" w:eastAsia="Arial" w:hAnsi="Arial"/>
-                <w:sz w:val="18"/>
-                <w:szCs w:val="18"/>
-              </w:rPr>
-              <w:t xml:space="preserve">Sim</w:t>
-            </w:r>
-          </w:p>
-        </w:tc>
-      </w:tr>
-      <w:tr>
-        <w:trPr>
-          <w:cantSplit/>
-        </w:trPr>
-        <w:tc>
-          <w:tcPr>
-            <w:tcW w:type="dxa" w:w="5338"/>
-            <w:tcBorders>
-              <w:top w:val="single" w:color="A6B4C4" w:sz="4"/>
-              <w:left w:val="single" w:color="A6B4C4" w:sz="4"/>
-              <w:bottom w:val="single" w:color="A6B4C4" w:sz="4"/>
-              <w:right w:val="single" w:color="A6B4C4" w:sz="4"/>
-            </w:tcBorders>
-            <w:tcMar>
-              <w:top w:type="dxa" w:w="60"/>
-              <w:left w:type="dxa" w:w="90"/>
-              <w:bottom w:type="dxa" w:w="60"/>
-              <w:right w:type="dxa" w:w="90"/>
-            </w:tcMar>
-            <w:vAlign w:val="center"/>
-          </w:tcPr>
-          <w:p>
-            <w:pPr>
-              <w:jc w:val="left"/>
-            </w:pPr>
-            <w:r>
-              <w:rPr>
-                <w:rFonts w:ascii="Arial" w:cs="Arial" w:eastAsia="Arial" w:hAnsi="Arial"/>
-                <w:sz w:val="18"/>
-                <w:szCs w:val="18"/>
-              </w:rPr>
-              <w:t xml:space="preserve">Ver os próprios dados e trocar a senha (/usuarios/me)</w:t>
-            </w:r>
-          </w:p>
-        </w:tc>
-        <w:tc>
-          <w:tcPr>
-            <w:tcW w:type="dxa" w:w="1400"/>
-            <w:tcBorders>
-              <w:top w:val="single" w:color="A6B4C4" w:sz="4"/>
-              <w:left w:val="single" w:color="A6B4C4" w:sz="4"/>
-              <w:bottom w:val="single" w:color="A6B4C4" w:sz="4"/>
-              <w:right w:val="single" w:color="A6B4C4" w:sz="4"/>
-            </w:tcBorders>
-            <w:tcMar>
-              <w:top w:type="dxa" w:w="60"/>
-              <w:left w:type="dxa" w:w="90"/>
-              <w:bottom w:type="dxa" w:w="60"/>
-              <w:right w:type="dxa" w:w="90"/>
-            </w:tcMar>
-            <w:vAlign w:val="center"/>
-          </w:tcPr>
-          <w:p>
-            <w:pPr>
-              <w:jc w:val="center"/>
-            </w:pPr>
-            <w:r>
-              <w:rPr>
-                <w:rFonts w:ascii="Arial" w:cs="Arial" w:eastAsia="Arial" w:hAnsi="Arial"/>
-                <w:sz w:val="18"/>
-                <w:szCs w:val="18"/>
-              </w:rPr>
-              <w:t xml:space="preserve">Não</w:t>
-            </w:r>
-          </w:p>
-        </w:tc>
-        <w:tc>
-          <w:tcPr>
-            <w:tcW w:type="dxa" w:w="1450"/>
-            <w:tcBorders>
-              <w:top w:val="single" w:color="A6B4C4" w:sz="4"/>
-              <w:left w:val="single" w:color="A6B4C4" w:sz="4"/>
-              <w:bottom w:val="single" w:color="A6B4C4" w:sz="4"/>
-              <w:right w:val="single" w:color="A6B4C4" w:sz="4"/>
-            </w:tcBorders>
-            <w:tcMar>
-              <w:top w:type="dxa" w:w="60"/>
-              <w:left w:type="dxa" w:w="90"/>
-              <w:bottom w:type="dxa" w:w="60"/>
-              <w:right w:type="dxa" w:w="90"/>
-            </w:tcMar>
-            <w:vAlign w:val="center"/>
-          </w:tcPr>
-          <w:p>
-            <w:pPr>
-              <w:jc w:val="center"/>
-            </w:pPr>
-            <w:r>
-              <w:rPr>
-                <w:rFonts w:ascii="Arial" w:cs="Arial" w:eastAsia="Arial" w:hAnsi="Arial"/>
-                <w:sz w:val="18"/>
-                <w:szCs w:val="18"/>
-              </w:rPr>
-              <w:t xml:space="preserve">Sim</w:t>
-            </w:r>
-          </w:p>
-        </w:tc>
-        <w:tc>
-          <w:tcPr>
-            <w:tcW w:type="dxa" w:w="1450"/>
-            <w:tcBorders>
-              <w:top w:val="single" w:color="A6B4C4" w:sz="4"/>
-              <w:left w:val="single" w:color="A6B4C4" w:sz="4"/>
-              <w:bottom w:val="single" w:color="A6B4C4" w:sz="4"/>
-              <w:right w:val="single" w:color="A6B4C4" w:sz="4"/>
-            </w:tcBorders>
-            <w:tcMar>
-              <w:top w:type="dxa" w:w="60"/>
-              <w:left w:type="dxa" w:w="90"/>
-              <w:bottom w:type="dxa" w:w="60"/>
-              <w:right w:type="dxa" w:w="90"/>
-            </w:tcMar>
-            <w:vAlign w:val="center"/>
-          </w:tcPr>
-          <w:p>
-            <w:pPr>
-              <w:jc w:val="center"/>
-            </w:pPr>
-            <w:r>
-              <w:rPr>
-                <w:rFonts w:ascii="Arial" w:cs="Arial" w:eastAsia="Arial" w:hAnsi="Arial"/>
-                <w:sz w:val="18"/>
-                <w:szCs w:val="18"/>
-              </w:rPr>
-              <w:t xml:space="preserve">Sim</w:t>
-            </w:r>
-          </w:p>
-        </w:tc>
-      </w:tr>
-      <w:tr>
-        <w:trPr>
-          <w:cantSplit/>
-        </w:trPr>
-        <w:tc>
-          <w:tcPr>
-            <w:tcW w:type="dxa" w:w="5338"/>
-            <w:tcBorders>
-              <w:top w:val="single" w:color="A6B4C4" w:sz="4"/>
-              <w:left w:val="single" w:color="A6B4C4" w:sz="4"/>
-              <w:bottom w:val="single" w:color="A6B4C4" w:sz="4"/>
-              <w:right w:val="single" w:color="A6B4C4" w:sz="4"/>
-            </w:tcBorders>
-            <w:shd w:fill="F5F7FA" w:color="auto" w:val="clear"/>
-            <w:tcMar>
-              <w:top w:type="dxa" w:w="60"/>
-              <w:left w:type="dxa" w:w="90"/>
-              <w:bottom w:type="dxa" w:w="60"/>
-              <w:right w:type="dxa" w:w="90"/>
-            </w:tcMar>
-            <w:vAlign w:val="center"/>
-          </w:tcPr>
-          <w:p>
-            <w:pPr>
-              <w:jc w:val="left"/>
-            </w:pPr>
-            <w:r>
-              <w:rPr>
-                <w:rFonts w:ascii="Arial" w:cs="Arial" w:eastAsia="Arial" w:hAnsi="Arial"/>
-                <w:sz w:val="18"/>
-                <w:szCs w:val="18"/>
-              </w:rPr>
               <w:t xml:space="preserve">Gerenciar usuários (/usuarios)</w:t>
             </w:r>
           </w:p>
@@ -9687,8 +8688,12 @@
     </w:tbl>
     <w:p>
       <w:pPr>
+        <w:spacing w:after="80"/>
+      </w:pPr>
+    </w:p>
+    <w:p>
+      <w:pPr>
         <w:pStyle w:val="Heading1"/>
-        <w:spacing w:after="160" w:before="300"/>
       </w:pPr>
       <w:r>
         <w:t xml:space="preserve">4. Relação com o conteúdo das aulas</w:t>
@@ -9745,7 +8750,7 @@
                 <w:sz w:val="17"/>
                 <w:szCs w:val="17"/>
               </w:rPr>
-              <w:t xml:space="preserve">Aula</w:t>
+              <w:t xml:space="preserve">Aula / Material</w:t>
             </w:r>
           </w:p>
         </w:tc>
@@ -9780,7 +8785,7 @@
                 <w:sz w:val="17"/>
                 <w:szCs w:val="17"/>
               </w:rPr>
-              <w:t xml:space="preserve">Como foi aplicada no plano</w:t>
+              <w:t xml:space="preserve">Como foi aplicado no plano</w:t>
             </w:r>
           </w:p>
         </w:tc>
@@ -9816,7 +8821,7 @@
                 <w:sz w:val="17"/>
                 <w:szCs w:val="17"/>
               </w:rPr>
-              <w:t xml:space="preserve">Aula 2 — HTTP na prática</w:t>
+              <w:t xml:space="preserve">Aula 02 — HTTP na prática</w:t>
             </w:r>
           </w:p>
         </w:tc>
@@ -9847,7 +8852,7 @@
                 <w:sz w:val="17"/>
                 <w:szCs w:val="17"/>
               </w:rPr>
-              <w:t xml:space="preserve">Token enviado no header Authorization; status codes coerentes (401 sem login, 403 sem permissão, 400 dados inválidos, 404 não encontrado); Content-Type: application/json.</w:t>
+              <w:t xml:space="preserve">Token no header Authorization; status codes 401, 403, 400, 404, 201 e 204; Content-Type: application/json.</w:t>
             </w:r>
           </w:p>
         </w:tc>
@@ -9916,7 +8921,7 @@
                 <w:sz w:val="17"/>
                 <w:szCs w:val="17"/>
               </w:rPr>
-              <w:t xml:space="preserve">Cada controle foi colocado em uma camada (Controller, Service, Repository, Domain), sem misturar segurança com regra de negócio.</w:t>
+              <w:t xml:space="preserve">Cada controle fica em uma camada: Controller, Service, Repository, Domain.</w:t>
             </w:r>
           </w:p>
         </w:tc>
@@ -9983,7 +8988,7 @@
                 <w:sz w:val="17"/>
                 <w:szCs w:val="17"/>
               </w:rPr>
-              <w:t xml:space="preserve">Uso do Spring Security (projeto do ecossistema para autenticação e autorização); injeção de dependência do PasswordEncoder; configuração externa e Actuator restrito a health.</w:t>
+              <w:t xml:space="preserve">Spring Security como projeto do ecossistema; injeção do PasswordEncoder como @Bean; configuração externa (variáveis de ambiente).</w:t>
             </w:r>
           </w:p>
         </w:tc>
@@ -10020,7 +9025,7 @@
                 <w:sz w:val="17"/>
                 <w:szCs w:val="17"/>
               </w:rPr>
-              <w:t xml:space="preserve">Aula 5 — ORM, JPA e PostgreSQL</w:t>
+              <w:t xml:space="preserve">Aula 6 — ORM, JPA e PostgreSQL</w:t>
             </w:r>
           </w:p>
         </w:tc>
@@ -10052,7 +9057,7 @@
                 <w:sz w:val="17"/>
                 <w:szCs w:val="17"/>
               </w:rPr>
-              <w:t xml:space="preserve">Comparação com o PreparedStatement (parâmetros "?") para evitar SQL Injection; @Transactional com rollback nas movimentações; usuário próprio no PostgreSQL; ddl-auto e show-sql ajustados por ambiente.</w:t>
+              <w:t xml:space="preserve">Parâmetros como no PreparedStatement contra SQL Injection; @Transactional com rollback; usuário próprio no PostgreSQL.</w:t>
             </w:r>
           </w:p>
         </w:tc>
@@ -10088,7 +9093,7 @@
                 <w:sz w:val="17"/>
                 <w:szCs w:val="17"/>
               </w:rPr>
-              <w:t xml:space="preserve">Aula 6 — Spring Data JPA</w:t>
+              <w:t xml:space="preserve">Aula 7 — Spring Data JPA</w:t>
             </w:r>
           </w:p>
         </w:tc>
@@ -10119,7 +9124,7 @@
                 <w:sz w:val="17"/>
                 <w:szCs w:val="17"/>
               </w:rPr>
-              <w:t xml:space="preserve">JpaRepository, consultas derivadas e @Query com @Param em vez de SQL montado; cuidado com nativeQuery; Pageable para limitar listagens; findById + exceção para responder 404.</w:t>
+              <w:t xml:space="preserve">JpaRepository, consultas derivadas, @Query com @Param, cuidado com nativeQuery, Pageable, findById para responder 404.</w:t>
             </w:r>
           </w:p>
         </w:tc>
@@ -10156,7 +9161,7 @@
                 <w:sz w:val="17"/>
                 <w:szCs w:val="17"/>
               </w:rPr>
-              <w:t xml:space="preserve">Aula 7 — Versionamento de banco (Flyway)</w:t>
+              <w:t xml:space="preserve">Aula 9 — Versionamento de banco (Flyway)</w:t>
             </w:r>
           </w:p>
         </w:tc>
@@ -10188,7 +9193,143 @@
                 <w:sz w:val="17"/>
                 <w:szCs w:val="17"/>
               </w:rPr>
-              <w:t xml:space="preserve">Tabelas usuario e perfil criadas por migrações versionadas; admin inicial inserido por migração com senha já em hash BCrypt.</w:t>
+              <w:t xml:space="preserve">Tabela usuarios e Administrador inicial criados por migrações versionadas.</w:t>
+            </w:r>
+          </w:p>
+        </w:tc>
+      </w:tr>
+      <w:tr>
+        <w:trPr>
+          <w:cantSplit/>
+        </w:trPr>
+        <w:tc>
+          <w:tcPr>
+            <w:tcW w:type="dxa" w:w="3000"/>
+            <w:tcBorders>
+              <w:top w:val="single" w:color="A6B4C4" w:sz="4"/>
+              <w:left w:val="single" w:color="A6B4C4" w:sz="4"/>
+              <w:bottom w:val="single" w:color="A6B4C4" w:sz="4"/>
+              <w:right w:val="single" w:color="A6B4C4" w:sz="4"/>
+            </w:tcBorders>
+            <w:tcMar>
+              <w:top w:type="dxa" w:w="60"/>
+              <w:left w:type="dxa" w:w="90"/>
+              <w:bottom w:type="dxa" w:w="60"/>
+              <w:right w:type="dxa" w:w="90"/>
+            </w:tcMar>
+            <w:vAlign w:val="center"/>
+          </w:tcPr>
+          <w:p>
+            <w:pPr>
+              <w:jc w:val="left"/>
+            </w:pPr>
+            <w:r>
+              <w:rPr>
+                <w:rFonts w:ascii="Arial" w:cs="Arial" w:eastAsia="Arial" w:hAnsi="Arial"/>
+                <w:sz w:val="17"/>
+                <w:szCs w:val="17"/>
+              </w:rPr>
+              <w:t xml:space="preserve">Aula 10 — Autenticação em APIs</w:t>
+            </w:r>
+          </w:p>
+        </w:tc>
+        <w:tc>
+          <w:tcPr>
+            <w:tcW w:type="dxa" w:w="6638"/>
+            <w:tcBorders>
+              <w:top w:val="single" w:color="A6B4C4" w:sz="4"/>
+              <w:left w:val="single" w:color="A6B4C4" w:sz="4"/>
+              <w:bottom w:val="single" w:color="A6B4C4" w:sz="4"/>
+              <w:right w:val="single" w:color="A6B4C4" w:sz="4"/>
+            </w:tcBorders>
+            <w:tcMar>
+              <w:top w:type="dxa" w:w="60"/>
+              <w:left w:type="dxa" w:w="90"/>
+              <w:bottom w:type="dxa" w:w="60"/>
+              <w:right w:type="dxa" w:w="90"/>
+            </w:tcMar>
+            <w:vAlign w:val="center"/>
+          </w:tcPr>
+          <w:p>
+            <w:pPr>
+              <w:jc w:val="left"/>
+            </w:pPr>
+            <w:r>
+              <w:rPr>
+                <w:rFonts w:ascii="Arial" w:cs="Arial" w:eastAsia="Arial" w:hAnsi="Arial"/>
+                <w:sz w:val="17"/>
+                <w:szCs w:val="17"/>
+              </w:rPr>
+              <w:t xml:space="preserve">Autenticação × autorização, Bearer token, API stateless, senha em hash BCrypt, tabela usuarios, UserDetailsService, AuthenticationManager, JWT (sub, iat, exp), csrf.disable(), /auth/** público.</w:t>
+            </w:r>
+          </w:p>
+        </w:tc>
+      </w:tr>
+      <w:tr>
+        <w:trPr>
+          <w:cantSplit/>
+        </w:trPr>
+        <w:tc>
+          <w:tcPr>
+            <w:tcW w:type="dxa" w:w="3000"/>
+            <w:tcBorders>
+              <w:top w:val="single" w:color="A6B4C4" w:sz="4"/>
+              <w:left w:val="single" w:color="A6B4C4" w:sz="4"/>
+              <w:bottom w:val="single" w:color="A6B4C4" w:sz="4"/>
+              <w:right w:val="single" w:color="A6B4C4" w:sz="4"/>
+            </w:tcBorders>
+            <w:shd w:fill="F5F7FA" w:color="auto" w:val="clear"/>
+            <w:tcMar>
+              <w:top w:type="dxa" w:w="60"/>
+              <w:left w:type="dxa" w:w="90"/>
+              <w:bottom w:type="dxa" w:w="60"/>
+              <w:right w:type="dxa" w:w="90"/>
+            </w:tcMar>
+            <w:vAlign w:val="center"/>
+          </w:tcPr>
+          <w:p>
+            <w:pPr>
+              <w:jc w:val="left"/>
+            </w:pPr>
+            <w:r>
+              <w:rPr>
+                <w:rFonts w:ascii="Arial" w:cs="Arial" w:eastAsia="Arial" w:hAnsi="Arial"/>
+                <w:sz w:val="17"/>
+                <w:szCs w:val="17"/>
+              </w:rPr>
+              <w:t xml:space="preserve">EaD Bloco 3 — E-book Segurança em Sistemas Web</w:t>
+            </w:r>
+          </w:p>
+        </w:tc>
+        <w:tc>
+          <w:tcPr>
+            <w:tcW w:type="dxa" w:w="6638"/>
+            <w:tcBorders>
+              <w:top w:val="single" w:color="A6B4C4" w:sz="4"/>
+              <w:left w:val="single" w:color="A6B4C4" w:sz="4"/>
+              <w:bottom w:val="single" w:color="A6B4C4" w:sz="4"/>
+              <w:right w:val="single" w:color="A6B4C4" w:sz="4"/>
+            </w:tcBorders>
+            <w:shd w:fill="F5F7FA" w:color="auto" w:val="clear"/>
+            <w:tcMar>
+              <w:top w:type="dxa" w:w="60"/>
+              <w:left w:type="dxa" w:w="90"/>
+              <w:bottom w:type="dxa" w:w="60"/>
+              <w:right w:type="dxa" w:w="90"/>
+            </w:tcMar>
+            <w:vAlign w:val="center"/>
+          </w:tcPr>
+          <w:p>
+            <w:pPr>
+              <w:jc w:val="left"/>
+            </w:pPr>
+            <w:r>
+              <w:rPr>
+                <w:rFonts w:ascii="Arial" w:cs="Arial" w:eastAsia="Arial" w:hAnsi="Arial"/>
+                <w:sz w:val="17"/>
+                <w:szCs w:val="17"/>
+              </w:rPr>
+              <w:t xml:space="preserve">SSL/TLS e HTTPS, SQL Injection, XSS, CSRF, Clickjacking, autenticação e autorização, OAuth 2.0 e JWT, CORS.</w:t>
             </w:r>
           </w:p>
         </w:tc>
@@ -10209,7 +9350,7 @@
           <w:sz w:val="21"/>
           <w:szCs w:val="21"/>
         </w:rPr>
-        <w:t xml:space="preserve">Essas decisões orientarão a próxima etapa, a implementação com Spring Security: SecurityFilterChain, filtro do token, @PreAuthorize, BCryptPasswordEncoder, configuração de CORS e as migrações Flyway das tabelas de usuário.</w:t>
+        <w:t xml:space="preserve">Essas decisões serão implementadas com Spring Security nas próximas etapas do projeto (autenticação, Aula 10, e autorização, Aula 11).</w:t>
       </w:r>
     </w:p>
     <w:sectPr>

</xml_diff>